<commit_message>
Add real report content
</commit_message>
<xml_diff>
--- a/REPORT.docx
+++ b/REPORT.docx
@@ -94,7 +94,36 @@
           <w:szCs w:val="24"/>
         </w:rPr>
         <w:br/>
-        <w:t>Ссылка на репозиторий GitHub: [вставишь после пуша]</w:t>
+        <w:t xml:space="preserve">Ссылка на репозиторий </w:t>
+      </w:r>
+      <w:proofErr w:type="spellStart"/>
+      <w:r>
+        <w:rPr>
+          <w:rFonts w:cs="Times New Roman"/>
+          <w:sz w:val="24"/>
+          <w:szCs w:val="24"/>
+        </w:rPr>
+        <w:t>GitHub</w:t>
+      </w:r>
+      <w:proofErr w:type="spellEnd"/>
+      <w:r>
+        <w:rPr>
+          <w:rFonts w:cs="Times New Roman"/>
+          <w:sz w:val="24"/>
+          <w:szCs w:val="24"/>
+        </w:rPr>
+        <w:t>:</w:t>
+      </w:r>
+      <w:r>
+        <w:t xml:space="preserve"> </w:t>
+      </w:r>
+      <w:r>
+        <w:rPr>
+          <w:rFonts w:cs="Times New Roman"/>
+          <w:sz w:val="24"/>
+          <w:szCs w:val="24"/>
+        </w:rPr>
+        <w:t>https://github.com/BOENKOMAT-MQ/pr5-Nazarenko-M.D</w:t>
       </w:r>
       <w:r>
         <w:rPr>
@@ -165,7 +194,61 @@
           <w:sz w:val="24"/>
           <w:szCs w:val="24"/>
         </w:rPr>
-        <w:t>Цель работы — закрепить базовые средства Java (String и split, массивы примитивов, циклы, условные операторы, методы с параметрами и возвращаемым значением, валидацию ввода) на прикладной задаче анализа табеля учёта рабочего времени. Получить работающую программу, которая разбирает строку табеля, вычисляет показатели и обрабатывает ошибки ввода, а также связать код с Activity-диаграммой и диаграммой классов.</w:t>
+        <w:t>Цель работы — закрепить базовые средства Java (</w:t>
+      </w:r>
+      <w:proofErr w:type="spellStart"/>
+      <w:r>
+        <w:rPr>
+          <w:rFonts w:cs="Times New Roman"/>
+          <w:sz w:val="24"/>
+          <w:szCs w:val="24"/>
+        </w:rPr>
+        <w:t>String</w:t>
+      </w:r>
+      <w:proofErr w:type="spellEnd"/>
+      <w:r>
+        <w:rPr>
+          <w:rFonts w:cs="Times New Roman"/>
+          <w:sz w:val="24"/>
+          <w:szCs w:val="24"/>
+        </w:rPr>
+        <w:t xml:space="preserve"> и </w:t>
+      </w:r>
+      <w:proofErr w:type="spellStart"/>
+      <w:r>
+        <w:rPr>
+          <w:rFonts w:cs="Times New Roman"/>
+          <w:sz w:val="24"/>
+          <w:szCs w:val="24"/>
+        </w:rPr>
+        <w:t>split</w:t>
+      </w:r>
+      <w:proofErr w:type="spellEnd"/>
+      <w:r>
+        <w:rPr>
+          <w:rFonts w:cs="Times New Roman"/>
+          <w:sz w:val="24"/>
+          <w:szCs w:val="24"/>
+        </w:rPr>
+        <w:t xml:space="preserve">, массивы примитивов, циклы, условные операторы, методы с параметрами и возвращаемым значением, валидацию ввода) на прикладной задаче анализа табеля учёта рабочего времени. Получить работающую программу, которая разбирает строку табеля, вычисляет показатели и обрабатывает ошибки ввода, а также связать код с </w:t>
+      </w:r>
+      <w:proofErr w:type="spellStart"/>
+      <w:r>
+        <w:rPr>
+          <w:rFonts w:cs="Times New Roman"/>
+          <w:sz w:val="24"/>
+          <w:szCs w:val="24"/>
+        </w:rPr>
+        <w:t>Activity</w:t>
+      </w:r>
+      <w:proofErr w:type="spellEnd"/>
+      <w:r>
+        <w:rPr>
+          <w:rFonts w:cs="Times New Roman"/>
+          <w:sz w:val="24"/>
+          <w:szCs w:val="24"/>
+        </w:rPr>
+        <w:t>-диаграммой и диаграммой классов.</w:t>
       </w:r>
     </w:p>
     <w:p>
@@ -231,112 +314,553 @@
           <w:sz w:val="24"/>
           <w:szCs w:val="24"/>
         </w:rPr>
-        <w:t>Класс TimesheetAnalyzer содержит 6 публичных статических методов без состояния.</w:t>
-      </w:r>
-    </w:p>
-    <w:p>
-      <w:pPr>
-        <w:spacing w:after="0" w:line="360" w:lineRule="auto"/>
-        <w:rPr>
-          <w:rFonts w:cs="Times New Roman"/>
-          <w:sz w:val="24"/>
-          <w:szCs w:val="24"/>
-        </w:rPr>
-      </w:pPr>
-    </w:p>
-    <w:p>
-      <w:pPr>
-        <w:spacing w:after="0" w:line="360" w:lineRule="auto"/>
-        <w:rPr>
-          <w:rFonts w:cs="Times New Roman"/>
-          <w:sz w:val="24"/>
-          <w:szCs w:val="24"/>
-        </w:rPr>
-      </w:pPr>
-      <w:r>
-        <w:rPr>
-          <w:rFonts w:cs="Times New Roman"/>
-          <w:sz w:val="24"/>
-          <w:szCs w:val="24"/>
-        </w:rPr>
-        <w:t>parseHours(String line) — единственная точка валидации строки. Разбивает вход по разделителю «;» с аргументом -1 (сохраняет trailing-пустые), проверяет, что получено ровно 5 значений, каждое значение проверяет на regex ^(0|[1-9][0-9]*)$ и на диапазон [0, 16]. При ошибке бросает IllegalArgumentException с номером позиции. Возвращает int[5].</w:t>
-      </w:r>
-    </w:p>
-    <w:p>
-      <w:pPr>
-        <w:spacing w:after="0" w:line="360" w:lineRule="auto"/>
-        <w:rPr>
-          <w:rFonts w:cs="Times New Roman"/>
-          <w:sz w:val="24"/>
-          <w:szCs w:val="24"/>
-        </w:rPr>
-      </w:pPr>
-    </w:p>
-    <w:p>
-      <w:pPr>
-        <w:spacing w:after="0" w:line="360" w:lineRule="auto"/>
-        <w:rPr>
-          <w:rFonts w:cs="Times New Roman"/>
-          <w:sz w:val="24"/>
-          <w:szCs w:val="24"/>
-        </w:rPr>
-      </w:pPr>
-      <w:r>
-        <w:rPr>
-          <w:rFonts w:cs="Times New Roman"/>
-          <w:sz w:val="24"/>
-          <w:szCs w:val="24"/>
-        </w:rPr>
-        <w:t>total(int[] hours) — принимает валидный массив, проверяет null и длину 5, возвращает сумму через цикл for-each. Stream API в работе запрещён.</w:t>
-      </w:r>
-    </w:p>
-    <w:p>
-      <w:pPr>
-        <w:spacing w:after="0" w:line="360" w:lineRule="auto"/>
-        <w:rPr>
-          <w:rFonts w:cs="Times New Roman"/>
-          <w:sz w:val="24"/>
-          <w:szCs w:val="24"/>
-        </w:rPr>
-      </w:pPr>
-    </w:p>
-    <w:p>
-      <w:pPr>
-        <w:spacing w:after="0" w:line="360" w:lineRule="auto"/>
-        <w:rPr>
-          <w:rFonts w:cs="Times New Roman"/>
-          <w:sz w:val="24"/>
-          <w:szCs w:val="24"/>
-        </w:rPr>
-      </w:pPr>
-      <w:r>
-        <w:rPr>
-          <w:rFonts w:cs="Times New Roman"/>
-          <w:sz w:val="24"/>
-          <w:szCs w:val="24"/>
-        </w:rPr>
-        <w:t>average(int[] hours) — вызывает total(hours), делит на 5, округляет до двух знаков через Math.round(value * 100.0) / 100.0.</w:t>
-      </w:r>
-    </w:p>
-    <w:p>
-      <w:pPr>
-        <w:spacing w:after="0" w:line="360" w:lineRule="auto"/>
-        <w:rPr>
-          <w:rFonts w:cs="Times New Roman"/>
-          <w:sz w:val="24"/>
-          <w:szCs w:val="24"/>
-        </w:rPr>
-      </w:pPr>
-    </w:p>
-    <w:p>
-      <w:pPr>
-        <w:spacing w:after="0" w:line="360" w:lineRule="auto"/>
-        <w:rPr>
-          <w:rFonts w:cs="Times New Roman"/>
-          <w:sz w:val="24"/>
-          <w:szCs w:val="24"/>
-        </w:rPr>
-      </w:pPr>
+        <w:t xml:space="preserve">Класс </w:t>
+      </w:r>
+      <w:proofErr w:type="spellStart"/>
+      <w:r>
+        <w:rPr>
+          <w:rFonts w:cs="Times New Roman"/>
+          <w:sz w:val="24"/>
+          <w:szCs w:val="24"/>
+        </w:rPr>
+        <w:t>TimesheetAnalyzer</w:t>
+      </w:r>
+      <w:proofErr w:type="spellEnd"/>
+      <w:r>
+        <w:rPr>
+          <w:rFonts w:cs="Times New Roman"/>
+          <w:sz w:val="24"/>
+          <w:szCs w:val="24"/>
+        </w:rPr>
+        <w:t xml:space="preserve"> содержит 6 публичных статических методов без состояния.</w:t>
+      </w:r>
+    </w:p>
+    <w:p>
+      <w:pPr>
+        <w:spacing w:after="0" w:line="360" w:lineRule="auto"/>
+        <w:rPr>
+          <w:rFonts w:cs="Times New Roman"/>
+          <w:sz w:val="24"/>
+          <w:szCs w:val="24"/>
+        </w:rPr>
+      </w:pPr>
+    </w:p>
+    <w:p>
+      <w:pPr>
+        <w:spacing w:after="0" w:line="360" w:lineRule="auto"/>
+        <w:rPr>
+          <w:rFonts w:cs="Times New Roman"/>
+          <w:sz w:val="24"/>
+          <w:szCs w:val="24"/>
+        </w:rPr>
+      </w:pPr>
+      <w:proofErr w:type="spellStart"/>
+      <w:proofErr w:type="gramStart"/>
+      <w:r>
+        <w:rPr>
+          <w:rFonts w:cs="Times New Roman"/>
+          <w:sz w:val="24"/>
+          <w:szCs w:val="24"/>
+        </w:rPr>
+        <w:t>parseHours</w:t>
+      </w:r>
+      <w:proofErr w:type="spellEnd"/>
+      <w:r>
+        <w:rPr>
+          <w:rFonts w:cs="Times New Roman"/>
+          <w:sz w:val="24"/>
+          <w:szCs w:val="24"/>
+        </w:rPr>
+        <w:t>(</w:t>
+      </w:r>
+      <w:proofErr w:type="spellStart"/>
+      <w:proofErr w:type="gramEnd"/>
+      <w:r>
+        <w:rPr>
+          <w:rFonts w:cs="Times New Roman"/>
+          <w:sz w:val="24"/>
+          <w:szCs w:val="24"/>
+        </w:rPr>
+        <w:t>String</w:t>
+      </w:r>
+      <w:proofErr w:type="spellEnd"/>
+      <w:r>
+        <w:rPr>
+          <w:rFonts w:cs="Times New Roman"/>
+          <w:sz w:val="24"/>
+          <w:szCs w:val="24"/>
+        </w:rPr>
+        <w:t xml:space="preserve"> </w:t>
+      </w:r>
+      <w:proofErr w:type="spellStart"/>
+      <w:r>
+        <w:rPr>
+          <w:rFonts w:cs="Times New Roman"/>
+          <w:sz w:val="24"/>
+          <w:szCs w:val="24"/>
+        </w:rPr>
+        <w:t>line</w:t>
+      </w:r>
+      <w:proofErr w:type="spellEnd"/>
+      <w:r>
+        <w:rPr>
+          <w:rFonts w:cs="Times New Roman"/>
+          <w:sz w:val="24"/>
+          <w:szCs w:val="24"/>
+        </w:rPr>
+        <w:t xml:space="preserve">) — единственная точка валидации строки. Разбивает вход по разделителю «;» с аргументом -1 (сохраняет </w:t>
+      </w:r>
+      <w:proofErr w:type="spellStart"/>
+      <w:r>
+        <w:rPr>
+          <w:rFonts w:cs="Times New Roman"/>
+          <w:sz w:val="24"/>
+          <w:szCs w:val="24"/>
+        </w:rPr>
+        <w:t>trailing</w:t>
+      </w:r>
+      <w:proofErr w:type="spellEnd"/>
+      <w:r>
+        <w:rPr>
+          <w:rFonts w:cs="Times New Roman"/>
+          <w:sz w:val="24"/>
+          <w:szCs w:val="24"/>
+        </w:rPr>
+        <w:t xml:space="preserve">-пустые), проверяет, что получено ровно 5 значений, каждое значение проверяет на </w:t>
+      </w:r>
+      <w:proofErr w:type="spellStart"/>
+      <w:r>
+        <w:rPr>
+          <w:rFonts w:cs="Times New Roman"/>
+          <w:sz w:val="24"/>
+          <w:szCs w:val="24"/>
+        </w:rPr>
+        <w:t>regex</w:t>
+      </w:r>
+      <w:proofErr w:type="spellEnd"/>
+      <w:r>
+        <w:rPr>
+          <w:rFonts w:cs="Times New Roman"/>
+          <w:sz w:val="24"/>
+          <w:szCs w:val="24"/>
+        </w:rPr>
+        <w:t xml:space="preserve"> </w:t>
+      </w:r>
+      <w:proofErr w:type="gramStart"/>
+      <w:r>
+        <w:rPr>
+          <w:rFonts w:cs="Times New Roman"/>
+          <w:sz w:val="24"/>
+          <w:szCs w:val="24"/>
+        </w:rPr>
+        <w:t>^(</w:t>
+      </w:r>
+      <w:proofErr w:type="gramEnd"/>
+      <w:r>
+        <w:rPr>
+          <w:rFonts w:cs="Times New Roman"/>
+          <w:sz w:val="24"/>
+          <w:szCs w:val="24"/>
+        </w:rPr>
+        <w:t>0</w:t>
+      </w:r>
+      <w:proofErr w:type="gramStart"/>
+      <w:r>
+        <w:rPr>
+          <w:rFonts w:cs="Times New Roman"/>
+          <w:sz w:val="24"/>
+          <w:szCs w:val="24"/>
+        </w:rPr>
+        <w:t>|[</w:t>
+      </w:r>
+      <w:proofErr w:type="gramEnd"/>
+      <w:r>
+        <w:rPr>
+          <w:rFonts w:cs="Times New Roman"/>
+          <w:sz w:val="24"/>
+          <w:szCs w:val="24"/>
+        </w:rPr>
+        <w:t>1-</w:t>
+      </w:r>
+      <w:proofErr w:type="gramStart"/>
+      <w:r>
+        <w:rPr>
+          <w:rFonts w:cs="Times New Roman"/>
+          <w:sz w:val="24"/>
+          <w:szCs w:val="24"/>
+        </w:rPr>
+        <w:t>9][</w:t>
+      </w:r>
+      <w:proofErr w:type="gramEnd"/>
+      <w:r>
+        <w:rPr>
+          <w:rFonts w:cs="Times New Roman"/>
+          <w:sz w:val="24"/>
+          <w:szCs w:val="24"/>
+        </w:rPr>
+        <w:t>0-</w:t>
+      </w:r>
+      <w:proofErr w:type="gramStart"/>
+      <w:r>
+        <w:rPr>
+          <w:rFonts w:cs="Times New Roman"/>
+          <w:sz w:val="24"/>
+          <w:szCs w:val="24"/>
+        </w:rPr>
+        <w:t>9]*</w:t>
+      </w:r>
+      <w:proofErr w:type="gramEnd"/>
+      <w:r>
+        <w:rPr>
+          <w:rFonts w:cs="Times New Roman"/>
+          <w:sz w:val="24"/>
+          <w:szCs w:val="24"/>
+        </w:rPr>
+        <w:t xml:space="preserve">)$ и на диапазон [0, 16]. При ошибке бросает </w:t>
+      </w:r>
+      <w:proofErr w:type="spellStart"/>
+      <w:r>
+        <w:rPr>
+          <w:rFonts w:cs="Times New Roman"/>
+          <w:sz w:val="24"/>
+          <w:szCs w:val="24"/>
+        </w:rPr>
+        <w:t>IllegalArgumentException</w:t>
+      </w:r>
+      <w:proofErr w:type="spellEnd"/>
+      <w:r>
+        <w:rPr>
+          <w:rFonts w:cs="Times New Roman"/>
+          <w:sz w:val="24"/>
+          <w:szCs w:val="24"/>
+        </w:rPr>
+        <w:t xml:space="preserve"> с номером позиции. Возвращает </w:t>
+      </w:r>
+      <w:proofErr w:type="spellStart"/>
+      <w:proofErr w:type="gramStart"/>
+      <w:r>
+        <w:rPr>
+          <w:rFonts w:cs="Times New Roman"/>
+          <w:sz w:val="24"/>
+          <w:szCs w:val="24"/>
+        </w:rPr>
+        <w:t>int</w:t>
+      </w:r>
+      <w:proofErr w:type="spellEnd"/>
+      <w:r>
+        <w:rPr>
+          <w:rFonts w:cs="Times New Roman"/>
+          <w:sz w:val="24"/>
+          <w:szCs w:val="24"/>
+        </w:rPr>
+        <w:t>[</w:t>
+      </w:r>
+      <w:proofErr w:type="gramEnd"/>
+      <w:r>
+        <w:rPr>
+          <w:rFonts w:cs="Times New Roman"/>
+          <w:sz w:val="24"/>
+          <w:szCs w:val="24"/>
+        </w:rPr>
+        <w:t>5].</w:t>
+      </w:r>
+    </w:p>
+    <w:p>
+      <w:pPr>
+        <w:spacing w:after="0" w:line="360" w:lineRule="auto"/>
+        <w:rPr>
+          <w:rFonts w:cs="Times New Roman"/>
+          <w:sz w:val="24"/>
+          <w:szCs w:val="24"/>
+        </w:rPr>
+      </w:pPr>
+    </w:p>
+    <w:p>
+      <w:pPr>
+        <w:spacing w:after="0" w:line="360" w:lineRule="auto"/>
+        <w:rPr>
+          <w:rFonts w:cs="Times New Roman"/>
+          <w:sz w:val="24"/>
+          <w:szCs w:val="24"/>
+        </w:rPr>
+      </w:pPr>
+      <w:proofErr w:type="spellStart"/>
+      <w:r>
+        <w:rPr>
+          <w:rFonts w:cs="Times New Roman"/>
+          <w:sz w:val="24"/>
+          <w:szCs w:val="24"/>
+        </w:rPr>
+        <w:t>total</w:t>
+      </w:r>
+      <w:proofErr w:type="spellEnd"/>
+      <w:r>
+        <w:rPr>
+          <w:rFonts w:cs="Times New Roman"/>
+          <w:sz w:val="24"/>
+          <w:szCs w:val="24"/>
+        </w:rPr>
+        <w:t>(</w:t>
+      </w:r>
+      <w:proofErr w:type="spellStart"/>
+      <w:proofErr w:type="gramStart"/>
+      <w:r>
+        <w:rPr>
+          <w:rFonts w:cs="Times New Roman"/>
+          <w:sz w:val="24"/>
+          <w:szCs w:val="24"/>
+        </w:rPr>
+        <w:t>int</w:t>
+      </w:r>
+      <w:proofErr w:type="spellEnd"/>
+      <w:r>
+        <w:rPr>
+          <w:rFonts w:cs="Times New Roman"/>
+          <w:sz w:val="24"/>
+          <w:szCs w:val="24"/>
+        </w:rPr>
+        <w:t>[</w:t>
+      </w:r>
+      <w:proofErr w:type="gramEnd"/>
+      <w:r>
+        <w:rPr>
+          <w:rFonts w:cs="Times New Roman"/>
+          <w:sz w:val="24"/>
+          <w:szCs w:val="24"/>
+        </w:rPr>
+        <w:t xml:space="preserve">] </w:t>
+      </w:r>
+      <w:proofErr w:type="spellStart"/>
+      <w:r>
+        <w:rPr>
+          <w:rFonts w:cs="Times New Roman"/>
+          <w:sz w:val="24"/>
+          <w:szCs w:val="24"/>
+        </w:rPr>
+        <w:t>hours</w:t>
+      </w:r>
+      <w:proofErr w:type="spellEnd"/>
+      <w:r>
+        <w:rPr>
+          <w:rFonts w:cs="Times New Roman"/>
+          <w:sz w:val="24"/>
+          <w:szCs w:val="24"/>
+        </w:rPr>
+        <w:t xml:space="preserve">) — принимает валидный массив, проверяет </w:t>
+      </w:r>
+      <w:proofErr w:type="spellStart"/>
+      <w:r>
+        <w:rPr>
+          <w:rFonts w:cs="Times New Roman"/>
+          <w:sz w:val="24"/>
+          <w:szCs w:val="24"/>
+        </w:rPr>
+        <w:t>null</w:t>
+      </w:r>
+      <w:proofErr w:type="spellEnd"/>
+      <w:r>
+        <w:rPr>
+          <w:rFonts w:cs="Times New Roman"/>
+          <w:sz w:val="24"/>
+          <w:szCs w:val="24"/>
+        </w:rPr>
+        <w:t xml:space="preserve"> и длину 5, возвращает сумму через цикл </w:t>
+      </w:r>
+      <w:proofErr w:type="spellStart"/>
+      <w:r>
+        <w:rPr>
+          <w:rFonts w:cs="Times New Roman"/>
+          <w:sz w:val="24"/>
+          <w:szCs w:val="24"/>
+        </w:rPr>
+        <w:t>for-each</w:t>
+      </w:r>
+      <w:proofErr w:type="spellEnd"/>
+      <w:r>
+        <w:rPr>
+          <w:rFonts w:cs="Times New Roman"/>
+          <w:sz w:val="24"/>
+          <w:szCs w:val="24"/>
+        </w:rPr>
+        <w:t>. Stream API в работе запрещён.</w:t>
+      </w:r>
+    </w:p>
+    <w:p>
+      <w:pPr>
+        <w:spacing w:after="0" w:line="360" w:lineRule="auto"/>
+        <w:rPr>
+          <w:rFonts w:cs="Times New Roman"/>
+          <w:sz w:val="24"/>
+          <w:szCs w:val="24"/>
+        </w:rPr>
+      </w:pPr>
+    </w:p>
+    <w:p>
+      <w:pPr>
+        <w:spacing w:after="0" w:line="360" w:lineRule="auto"/>
+        <w:rPr>
+          <w:rFonts w:cs="Times New Roman"/>
+          <w:sz w:val="24"/>
+          <w:szCs w:val="24"/>
+        </w:rPr>
+      </w:pPr>
+      <w:proofErr w:type="spellStart"/>
+      <w:r>
+        <w:rPr>
+          <w:rFonts w:cs="Times New Roman"/>
+          <w:sz w:val="24"/>
+          <w:szCs w:val="24"/>
+        </w:rPr>
+        <w:t>average</w:t>
+      </w:r>
+      <w:proofErr w:type="spellEnd"/>
+      <w:r>
+        <w:rPr>
+          <w:rFonts w:cs="Times New Roman"/>
+          <w:sz w:val="24"/>
+          <w:szCs w:val="24"/>
+        </w:rPr>
+        <w:t>(</w:t>
+      </w:r>
+      <w:proofErr w:type="spellStart"/>
+      <w:proofErr w:type="gramStart"/>
+      <w:r>
+        <w:rPr>
+          <w:rFonts w:cs="Times New Roman"/>
+          <w:sz w:val="24"/>
+          <w:szCs w:val="24"/>
+        </w:rPr>
+        <w:t>int</w:t>
+      </w:r>
+      <w:proofErr w:type="spellEnd"/>
+      <w:r>
+        <w:rPr>
+          <w:rFonts w:cs="Times New Roman"/>
+          <w:sz w:val="24"/>
+          <w:szCs w:val="24"/>
+        </w:rPr>
+        <w:t>[</w:t>
+      </w:r>
+      <w:proofErr w:type="gramEnd"/>
+      <w:r>
+        <w:rPr>
+          <w:rFonts w:cs="Times New Roman"/>
+          <w:sz w:val="24"/>
+          <w:szCs w:val="24"/>
+        </w:rPr>
+        <w:t xml:space="preserve">] </w:t>
+      </w:r>
+      <w:proofErr w:type="spellStart"/>
+      <w:r>
+        <w:rPr>
+          <w:rFonts w:cs="Times New Roman"/>
+          <w:sz w:val="24"/>
+          <w:szCs w:val="24"/>
+        </w:rPr>
+        <w:t>hours</w:t>
+      </w:r>
+      <w:proofErr w:type="spellEnd"/>
+      <w:r>
+        <w:rPr>
+          <w:rFonts w:cs="Times New Roman"/>
+          <w:sz w:val="24"/>
+          <w:szCs w:val="24"/>
+        </w:rPr>
+        <w:t xml:space="preserve">) — вызывает </w:t>
+      </w:r>
+      <w:proofErr w:type="spellStart"/>
+      <w:r>
+        <w:rPr>
+          <w:rFonts w:cs="Times New Roman"/>
+          <w:sz w:val="24"/>
+          <w:szCs w:val="24"/>
+        </w:rPr>
+        <w:t>total</w:t>
+      </w:r>
+      <w:proofErr w:type="spellEnd"/>
+      <w:r>
+        <w:rPr>
+          <w:rFonts w:cs="Times New Roman"/>
+          <w:sz w:val="24"/>
+          <w:szCs w:val="24"/>
+        </w:rPr>
+        <w:t>(</w:t>
+      </w:r>
+      <w:proofErr w:type="spellStart"/>
+      <w:r>
+        <w:rPr>
+          <w:rFonts w:cs="Times New Roman"/>
+          <w:sz w:val="24"/>
+          <w:szCs w:val="24"/>
+        </w:rPr>
+        <w:t>hours</w:t>
+      </w:r>
+      <w:proofErr w:type="spellEnd"/>
+      <w:r>
+        <w:rPr>
+          <w:rFonts w:cs="Times New Roman"/>
+          <w:sz w:val="24"/>
+          <w:szCs w:val="24"/>
+        </w:rPr>
+        <w:t xml:space="preserve">), делит на 5, округляет до двух знаков через </w:t>
+      </w:r>
+      <w:proofErr w:type="spellStart"/>
+      <w:r>
+        <w:rPr>
+          <w:rFonts w:cs="Times New Roman"/>
+          <w:sz w:val="24"/>
+          <w:szCs w:val="24"/>
+        </w:rPr>
+        <w:t>Math.round</w:t>
+      </w:r>
+      <w:proofErr w:type="spellEnd"/>
+      <w:r>
+        <w:rPr>
+          <w:rFonts w:cs="Times New Roman"/>
+          <w:sz w:val="24"/>
+          <w:szCs w:val="24"/>
+        </w:rPr>
+        <w:t>(</w:t>
+      </w:r>
+      <w:proofErr w:type="spellStart"/>
+      <w:r>
+        <w:rPr>
+          <w:rFonts w:cs="Times New Roman"/>
+          <w:sz w:val="24"/>
+          <w:szCs w:val="24"/>
+        </w:rPr>
+        <w:t>value</w:t>
+      </w:r>
+      <w:proofErr w:type="spellEnd"/>
+      <w:r>
+        <w:rPr>
+          <w:rFonts w:cs="Times New Roman"/>
+          <w:sz w:val="24"/>
+          <w:szCs w:val="24"/>
+        </w:rPr>
+        <w:t xml:space="preserve"> * 100.0) / 100.0.</w:t>
+      </w:r>
+    </w:p>
+    <w:p>
+      <w:pPr>
+        <w:spacing w:after="0" w:line="360" w:lineRule="auto"/>
+        <w:rPr>
+          <w:rFonts w:cs="Times New Roman"/>
+          <w:sz w:val="24"/>
+          <w:szCs w:val="24"/>
+        </w:rPr>
+      </w:pPr>
+    </w:p>
+    <w:p>
+      <w:pPr>
+        <w:spacing w:after="0" w:line="360" w:lineRule="auto"/>
+        <w:rPr>
+          <w:rFonts w:cs="Times New Roman"/>
+          <w:sz w:val="24"/>
+          <w:szCs w:val="24"/>
+        </w:rPr>
+      </w:pPr>
+      <w:proofErr w:type="spellStart"/>
       <w:r>
         <w:rPr>
           <w:rFonts w:cs="Times New Roman"/>
@@ -344,63 +868,322 @@
           <w:szCs w:val="24"/>
         </w:rPr>
         <w:lastRenderedPageBreak/>
-        <w:t>overtimeDays(int[] hours) — считает дни, где значение строго больше DAILY_NORMAL_HOURS = 8. Значение ровно 8 переработкой не считается.</w:t>
-      </w:r>
-    </w:p>
-    <w:p>
-      <w:pPr>
-        <w:spacing w:after="0" w:line="360" w:lineRule="auto"/>
-        <w:rPr>
-          <w:rFonts w:cs="Times New Roman"/>
-          <w:sz w:val="24"/>
-          <w:szCs w:val="24"/>
-        </w:rPr>
-      </w:pPr>
-    </w:p>
-    <w:p>
-      <w:pPr>
-        <w:spacing w:after="0" w:line="360" w:lineRule="auto"/>
-        <w:rPr>
-          <w:rFonts w:cs="Times New Roman"/>
-          <w:sz w:val="24"/>
-          <w:szCs w:val="24"/>
-        </w:rPr>
-      </w:pPr>
-      <w:r>
-        <w:rPr>
-          <w:rFonts w:cs="Times New Roman"/>
-          <w:sz w:val="24"/>
-          <w:szCs w:val="24"/>
-        </w:rPr>
-        <w:t>weeklyOvertime(int[] hours) — часть А варианта 3: возвращает недоработку до нормы max(0, 40 − sum). Норма 40 вынесена в константу WEEKLY_NORMAL_HOURS.</w:t>
-      </w:r>
-    </w:p>
-    <w:p>
-      <w:pPr>
-        <w:spacing w:after="0" w:line="360" w:lineRule="auto"/>
-        <w:rPr>
-          <w:rFonts w:cs="Times New Roman"/>
-          <w:sz w:val="24"/>
-          <w:szCs w:val="24"/>
-        </w:rPr>
-      </w:pPr>
-    </w:p>
-    <w:p>
-      <w:pPr>
-        <w:spacing w:after="0" w:line="360" w:lineRule="auto"/>
-        <w:rPr>
-          <w:rFonts w:cs="Times New Roman"/>
-          <w:sz w:val="24"/>
-          <w:szCs w:val="24"/>
-        </w:rPr>
-      </w:pPr>
-      <w:r>
-        <w:rPr>
-          <w:rFonts w:cs="Times New Roman"/>
-          <w:sz w:val="24"/>
-          <w:szCs w:val="24"/>
-        </w:rPr>
-        <w:t>addRestHours(int[] hours) — часть Б варианта 3: часы отдыха за неделю, max(0, 40 − total). Показывает, сколько часов сотрудник не добрал до нормы.</w:t>
+        <w:t>overtimeDays</w:t>
+      </w:r>
+      <w:proofErr w:type="spellEnd"/>
+      <w:r>
+        <w:rPr>
+          <w:rFonts w:cs="Times New Roman"/>
+          <w:sz w:val="24"/>
+          <w:szCs w:val="24"/>
+        </w:rPr>
+        <w:t>(</w:t>
+      </w:r>
+      <w:proofErr w:type="spellStart"/>
+      <w:proofErr w:type="gramStart"/>
+      <w:r>
+        <w:rPr>
+          <w:rFonts w:cs="Times New Roman"/>
+          <w:sz w:val="24"/>
+          <w:szCs w:val="24"/>
+        </w:rPr>
+        <w:t>int</w:t>
+      </w:r>
+      <w:proofErr w:type="spellEnd"/>
+      <w:r>
+        <w:rPr>
+          <w:rFonts w:cs="Times New Roman"/>
+          <w:sz w:val="24"/>
+          <w:szCs w:val="24"/>
+        </w:rPr>
+        <w:t>[</w:t>
+      </w:r>
+      <w:proofErr w:type="gramEnd"/>
+      <w:r>
+        <w:rPr>
+          <w:rFonts w:cs="Times New Roman"/>
+          <w:sz w:val="24"/>
+          <w:szCs w:val="24"/>
+        </w:rPr>
+        <w:t xml:space="preserve">] </w:t>
+      </w:r>
+      <w:proofErr w:type="spellStart"/>
+      <w:r>
+        <w:rPr>
+          <w:rFonts w:cs="Times New Roman"/>
+          <w:sz w:val="24"/>
+          <w:szCs w:val="24"/>
+        </w:rPr>
+        <w:t>hours</w:t>
+      </w:r>
+      <w:proofErr w:type="spellEnd"/>
+      <w:r>
+        <w:rPr>
+          <w:rFonts w:cs="Times New Roman"/>
+          <w:sz w:val="24"/>
+          <w:szCs w:val="24"/>
+        </w:rPr>
+        <w:t>) — считает дни, где значение строго больше DAILY_NORMAL_HOURS = 8. Значение ровно 8 переработкой не считается.</w:t>
+      </w:r>
+    </w:p>
+    <w:p>
+      <w:pPr>
+        <w:spacing w:after="0" w:line="360" w:lineRule="auto"/>
+        <w:rPr>
+          <w:rFonts w:cs="Times New Roman"/>
+          <w:sz w:val="24"/>
+          <w:szCs w:val="24"/>
+        </w:rPr>
+      </w:pPr>
+    </w:p>
+    <w:p>
+      <w:pPr>
+        <w:spacing w:after="0" w:line="360" w:lineRule="auto"/>
+        <w:rPr>
+          <w:rFonts w:cs="Times New Roman"/>
+          <w:sz w:val="24"/>
+          <w:szCs w:val="24"/>
+        </w:rPr>
+      </w:pPr>
+      <w:proofErr w:type="spellStart"/>
+      <w:r>
+        <w:rPr>
+          <w:rFonts w:cs="Times New Roman"/>
+          <w:sz w:val="24"/>
+          <w:szCs w:val="24"/>
+        </w:rPr>
+        <w:t>weeklyOvertime</w:t>
+      </w:r>
+      <w:proofErr w:type="spellEnd"/>
+      <w:r>
+        <w:rPr>
+          <w:rFonts w:cs="Times New Roman"/>
+          <w:sz w:val="24"/>
+          <w:szCs w:val="24"/>
+        </w:rPr>
+        <w:t>(</w:t>
+      </w:r>
+      <w:proofErr w:type="spellStart"/>
+      <w:proofErr w:type="gramStart"/>
+      <w:r>
+        <w:rPr>
+          <w:rFonts w:cs="Times New Roman"/>
+          <w:sz w:val="24"/>
+          <w:szCs w:val="24"/>
+        </w:rPr>
+        <w:t>int</w:t>
+      </w:r>
+      <w:proofErr w:type="spellEnd"/>
+      <w:r>
+        <w:rPr>
+          <w:rFonts w:cs="Times New Roman"/>
+          <w:sz w:val="24"/>
+          <w:szCs w:val="24"/>
+        </w:rPr>
+        <w:t>[</w:t>
+      </w:r>
+      <w:proofErr w:type="gramEnd"/>
+      <w:r>
+        <w:rPr>
+          <w:rFonts w:cs="Times New Roman"/>
+          <w:sz w:val="24"/>
+          <w:szCs w:val="24"/>
+        </w:rPr>
+        <w:t xml:space="preserve">] </w:t>
+      </w:r>
+      <w:proofErr w:type="spellStart"/>
+      <w:r>
+        <w:rPr>
+          <w:rFonts w:cs="Times New Roman"/>
+          <w:sz w:val="24"/>
+          <w:szCs w:val="24"/>
+        </w:rPr>
+        <w:t>hours</w:t>
+      </w:r>
+      <w:proofErr w:type="spellEnd"/>
+      <w:r>
+        <w:rPr>
+          <w:rFonts w:cs="Times New Roman"/>
+          <w:sz w:val="24"/>
+          <w:szCs w:val="24"/>
+        </w:rPr>
+        <w:t xml:space="preserve">) — часть А варианта 3: возвращает недоработку до нормы </w:t>
+      </w:r>
+      <w:proofErr w:type="spellStart"/>
+      <w:proofErr w:type="gramStart"/>
+      <w:r>
+        <w:rPr>
+          <w:rFonts w:cs="Times New Roman"/>
+          <w:sz w:val="24"/>
+          <w:szCs w:val="24"/>
+        </w:rPr>
+        <w:t>max</w:t>
+      </w:r>
+      <w:proofErr w:type="spellEnd"/>
+      <w:r>
+        <w:rPr>
+          <w:rFonts w:cs="Times New Roman"/>
+          <w:sz w:val="24"/>
+          <w:szCs w:val="24"/>
+        </w:rPr>
+        <w:t>(</w:t>
+      </w:r>
+      <w:proofErr w:type="gramEnd"/>
+      <w:r>
+        <w:rPr>
+          <w:rFonts w:cs="Times New Roman"/>
+          <w:sz w:val="24"/>
+          <w:szCs w:val="24"/>
+        </w:rPr>
+        <w:t xml:space="preserve">0, 40 − </w:t>
+      </w:r>
+      <w:proofErr w:type="spellStart"/>
+      <w:r>
+        <w:rPr>
+          <w:rFonts w:cs="Times New Roman"/>
+          <w:sz w:val="24"/>
+          <w:szCs w:val="24"/>
+        </w:rPr>
+        <w:t>sum</w:t>
+      </w:r>
+      <w:proofErr w:type="spellEnd"/>
+      <w:r>
+        <w:rPr>
+          <w:rFonts w:cs="Times New Roman"/>
+          <w:sz w:val="24"/>
+          <w:szCs w:val="24"/>
+        </w:rPr>
+        <w:t>). Норма 40 вынесена в константу WEEKLY_NORMAL_HOURS.</w:t>
+      </w:r>
+    </w:p>
+    <w:p>
+      <w:pPr>
+        <w:spacing w:after="0" w:line="360" w:lineRule="auto"/>
+        <w:rPr>
+          <w:rFonts w:cs="Times New Roman"/>
+          <w:sz w:val="24"/>
+          <w:szCs w:val="24"/>
+        </w:rPr>
+      </w:pPr>
+    </w:p>
+    <w:p>
+      <w:pPr>
+        <w:spacing w:after="0" w:line="360" w:lineRule="auto"/>
+        <w:rPr>
+          <w:rFonts w:cs="Times New Roman"/>
+          <w:sz w:val="24"/>
+          <w:szCs w:val="24"/>
+        </w:rPr>
+      </w:pPr>
+      <w:proofErr w:type="spellStart"/>
+      <w:r>
+        <w:rPr>
+          <w:rFonts w:cs="Times New Roman"/>
+          <w:sz w:val="24"/>
+          <w:szCs w:val="24"/>
+        </w:rPr>
+        <w:t>addRestHours</w:t>
+      </w:r>
+      <w:proofErr w:type="spellEnd"/>
+      <w:r>
+        <w:rPr>
+          <w:rFonts w:cs="Times New Roman"/>
+          <w:sz w:val="24"/>
+          <w:szCs w:val="24"/>
+        </w:rPr>
+        <w:t>(</w:t>
+      </w:r>
+      <w:proofErr w:type="spellStart"/>
+      <w:proofErr w:type="gramStart"/>
+      <w:r>
+        <w:rPr>
+          <w:rFonts w:cs="Times New Roman"/>
+          <w:sz w:val="24"/>
+          <w:szCs w:val="24"/>
+        </w:rPr>
+        <w:t>int</w:t>
+      </w:r>
+      <w:proofErr w:type="spellEnd"/>
+      <w:r>
+        <w:rPr>
+          <w:rFonts w:cs="Times New Roman"/>
+          <w:sz w:val="24"/>
+          <w:szCs w:val="24"/>
+        </w:rPr>
+        <w:t>[</w:t>
+      </w:r>
+      <w:proofErr w:type="gramEnd"/>
+      <w:r>
+        <w:rPr>
+          <w:rFonts w:cs="Times New Roman"/>
+          <w:sz w:val="24"/>
+          <w:szCs w:val="24"/>
+        </w:rPr>
+        <w:t xml:space="preserve">] </w:t>
+      </w:r>
+      <w:proofErr w:type="spellStart"/>
+      <w:r>
+        <w:rPr>
+          <w:rFonts w:cs="Times New Roman"/>
+          <w:sz w:val="24"/>
+          <w:szCs w:val="24"/>
+        </w:rPr>
+        <w:t>hours</w:t>
+      </w:r>
+      <w:proofErr w:type="spellEnd"/>
+      <w:r>
+        <w:rPr>
+          <w:rFonts w:cs="Times New Roman"/>
+          <w:sz w:val="24"/>
+          <w:szCs w:val="24"/>
+        </w:rPr>
+        <w:t xml:space="preserve">) — часть Б варианта 3: часы отдыха за неделю, </w:t>
+      </w:r>
+      <w:proofErr w:type="spellStart"/>
+      <w:proofErr w:type="gramStart"/>
+      <w:r>
+        <w:rPr>
+          <w:rFonts w:cs="Times New Roman"/>
+          <w:sz w:val="24"/>
+          <w:szCs w:val="24"/>
+        </w:rPr>
+        <w:t>max</w:t>
+      </w:r>
+      <w:proofErr w:type="spellEnd"/>
+      <w:r>
+        <w:rPr>
+          <w:rFonts w:cs="Times New Roman"/>
+          <w:sz w:val="24"/>
+          <w:szCs w:val="24"/>
+        </w:rPr>
+        <w:t>(</w:t>
+      </w:r>
+      <w:proofErr w:type="gramEnd"/>
+      <w:r>
+        <w:rPr>
+          <w:rFonts w:cs="Times New Roman"/>
+          <w:sz w:val="24"/>
+          <w:szCs w:val="24"/>
+        </w:rPr>
+        <w:t xml:space="preserve">0, 40 − </w:t>
+      </w:r>
+      <w:proofErr w:type="spellStart"/>
+      <w:r>
+        <w:rPr>
+          <w:rFonts w:cs="Times New Roman"/>
+          <w:sz w:val="24"/>
+          <w:szCs w:val="24"/>
+        </w:rPr>
+        <w:t>total</w:t>
+      </w:r>
+      <w:proofErr w:type="spellEnd"/>
+      <w:r>
+        <w:rPr>
+          <w:rFonts w:cs="Times New Roman"/>
+          <w:sz w:val="24"/>
+          <w:szCs w:val="24"/>
+        </w:rPr>
+        <w:t>). Показывает, сколько часов сотрудник не добрал до нормы.</w:t>
       </w:r>
     </w:p>
     <w:p>
@@ -494,35 +1277,245 @@
           <w:sz w:val="24"/>
           <w:szCs w:val="24"/>
         </w:rPr>
-        <w:t>Часть А: метод weeklyOvertime теперь возвращает недоработку до нормы max(0, 40 − sum) вместо переработки max(0, sum − 40). Формула локализована в одном методе, порог 40 вынесен в константу.</w:t>
-      </w:r>
-    </w:p>
-    <w:p>
-      <w:pPr>
-        <w:spacing w:after="0" w:line="360" w:lineRule="auto"/>
-        <w:rPr>
-          <w:rFonts w:cs="Times New Roman"/>
-          <w:sz w:val="24"/>
-          <w:szCs w:val="24"/>
-        </w:rPr>
-      </w:pPr>
-    </w:p>
-    <w:p>
-      <w:pPr>
-        <w:spacing w:after="0" w:line="360" w:lineRule="auto"/>
-        <w:rPr>
-          <w:rFonts w:cs="Times New Roman"/>
-          <w:sz w:val="24"/>
-          <w:szCs w:val="24"/>
-        </w:rPr>
-      </w:pPr>
-      <w:r>
-        <w:rPr>
-          <w:rFonts w:cs="Times New Roman"/>
-          <w:sz w:val="24"/>
-          <w:szCs w:val="24"/>
-        </w:rPr>
-        <w:t>Часть Б: addRestHours(int[] hours) → int — возвращает количество часов отдыха за неделю: 5 × 8 − total, но не менее 0. Если сотрудник отработал больше нормы, возвращает 0.</w:t>
+        <w:t xml:space="preserve">Часть А: метод </w:t>
+      </w:r>
+      <w:proofErr w:type="spellStart"/>
+      <w:r>
+        <w:rPr>
+          <w:rFonts w:cs="Times New Roman"/>
+          <w:sz w:val="24"/>
+          <w:szCs w:val="24"/>
+        </w:rPr>
+        <w:t>weeklyOvertime</w:t>
+      </w:r>
+      <w:proofErr w:type="spellEnd"/>
+      <w:r>
+        <w:rPr>
+          <w:rFonts w:cs="Times New Roman"/>
+          <w:sz w:val="24"/>
+          <w:szCs w:val="24"/>
+        </w:rPr>
+        <w:t xml:space="preserve"> теперь возвращает недоработку до нормы </w:t>
+      </w:r>
+      <w:proofErr w:type="spellStart"/>
+      <w:proofErr w:type="gramStart"/>
+      <w:r>
+        <w:rPr>
+          <w:rFonts w:cs="Times New Roman"/>
+          <w:sz w:val="24"/>
+          <w:szCs w:val="24"/>
+        </w:rPr>
+        <w:t>max</w:t>
+      </w:r>
+      <w:proofErr w:type="spellEnd"/>
+      <w:r>
+        <w:rPr>
+          <w:rFonts w:cs="Times New Roman"/>
+          <w:sz w:val="24"/>
+          <w:szCs w:val="24"/>
+        </w:rPr>
+        <w:t>(</w:t>
+      </w:r>
+      <w:proofErr w:type="gramEnd"/>
+      <w:r>
+        <w:rPr>
+          <w:rFonts w:cs="Times New Roman"/>
+          <w:sz w:val="24"/>
+          <w:szCs w:val="24"/>
+        </w:rPr>
+        <w:t xml:space="preserve">0, 40 − </w:t>
+      </w:r>
+      <w:proofErr w:type="spellStart"/>
+      <w:r>
+        <w:rPr>
+          <w:rFonts w:cs="Times New Roman"/>
+          <w:sz w:val="24"/>
+          <w:szCs w:val="24"/>
+        </w:rPr>
+        <w:t>sum</w:t>
+      </w:r>
+      <w:proofErr w:type="spellEnd"/>
+      <w:r>
+        <w:rPr>
+          <w:rFonts w:cs="Times New Roman"/>
+          <w:sz w:val="24"/>
+          <w:szCs w:val="24"/>
+        </w:rPr>
+        <w:t xml:space="preserve">) вместо переработки </w:t>
+      </w:r>
+      <w:proofErr w:type="spellStart"/>
+      <w:proofErr w:type="gramStart"/>
+      <w:r>
+        <w:rPr>
+          <w:rFonts w:cs="Times New Roman"/>
+          <w:sz w:val="24"/>
+          <w:szCs w:val="24"/>
+        </w:rPr>
+        <w:t>max</w:t>
+      </w:r>
+      <w:proofErr w:type="spellEnd"/>
+      <w:r>
+        <w:rPr>
+          <w:rFonts w:cs="Times New Roman"/>
+          <w:sz w:val="24"/>
+          <w:szCs w:val="24"/>
+        </w:rPr>
+        <w:t>(</w:t>
+      </w:r>
+      <w:proofErr w:type="gramEnd"/>
+      <w:r>
+        <w:rPr>
+          <w:rFonts w:cs="Times New Roman"/>
+          <w:sz w:val="24"/>
+          <w:szCs w:val="24"/>
+        </w:rPr>
+        <w:t xml:space="preserve">0, </w:t>
+      </w:r>
+      <w:proofErr w:type="spellStart"/>
+      <w:r>
+        <w:rPr>
+          <w:rFonts w:cs="Times New Roman"/>
+          <w:sz w:val="24"/>
+          <w:szCs w:val="24"/>
+        </w:rPr>
+        <w:t>sum</w:t>
+      </w:r>
+      <w:proofErr w:type="spellEnd"/>
+      <w:r>
+        <w:rPr>
+          <w:rFonts w:cs="Times New Roman"/>
+          <w:sz w:val="24"/>
+          <w:szCs w:val="24"/>
+        </w:rPr>
+        <w:t xml:space="preserve"> − 40). Формула локализована в одном методе, порог 40 вынесен в константу.</w:t>
+      </w:r>
+    </w:p>
+    <w:p>
+      <w:pPr>
+        <w:spacing w:after="0" w:line="360" w:lineRule="auto"/>
+        <w:rPr>
+          <w:rFonts w:cs="Times New Roman"/>
+          <w:sz w:val="24"/>
+          <w:szCs w:val="24"/>
+        </w:rPr>
+      </w:pPr>
+    </w:p>
+    <w:p>
+      <w:pPr>
+        <w:spacing w:after="0" w:line="360" w:lineRule="auto"/>
+        <w:rPr>
+          <w:rFonts w:cs="Times New Roman"/>
+          <w:sz w:val="24"/>
+          <w:szCs w:val="24"/>
+        </w:rPr>
+      </w:pPr>
+      <w:r>
+        <w:rPr>
+          <w:rFonts w:cs="Times New Roman"/>
+          <w:sz w:val="24"/>
+          <w:szCs w:val="24"/>
+        </w:rPr>
+        <w:t xml:space="preserve">Часть Б: </w:t>
+      </w:r>
+      <w:proofErr w:type="spellStart"/>
+      <w:r>
+        <w:rPr>
+          <w:rFonts w:cs="Times New Roman"/>
+          <w:sz w:val="24"/>
+          <w:szCs w:val="24"/>
+        </w:rPr>
+        <w:t>addRestHours</w:t>
+      </w:r>
+      <w:proofErr w:type="spellEnd"/>
+      <w:r>
+        <w:rPr>
+          <w:rFonts w:cs="Times New Roman"/>
+          <w:sz w:val="24"/>
+          <w:szCs w:val="24"/>
+        </w:rPr>
+        <w:t>(</w:t>
+      </w:r>
+      <w:proofErr w:type="spellStart"/>
+      <w:proofErr w:type="gramStart"/>
+      <w:r>
+        <w:rPr>
+          <w:rFonts w:cs="Times New Roman"/>
+          <w:sz w:val="24"/>
+          <w:szCs w:val="24"/>
+        </w:rPr>
+        <w:t>int</w:t>
+      </w:r>
+      <w:proofErr w:type="spellEnd"/>
+      <w:r>
+        <w:rPr>
+          <w:rFonts w:cs="Times New Roman"/>
+          <w:sz w:val="24"/>
+          <w:szCs w:val="24"/>
+        </w:rPr>
+        <w:t>[</w:t>
+      </w:r>
+      <w:proofErr w:type="gramEnd"/>
+      <w:r>
+        <w:rPr>
+          <w:rFonts w:cs="Times New Roman"/>
+          <w:sz w:val="24"/>
+          <w:szCs w:val="24"/>
+        </w:rPr>
+        <w:t xml:space="preserve">] </w:t>
+      </w:r>
+      <w:proofErr w:type="spellStart"/>
+      <w:r>
+        <w:rPr>
+          <w:rFonts w:cs="Times New Roman"/>
+          <w:sz w:val="24"/>
+          <w:szCs w:val="24"/>
+        </w:rPr>
+        <w:t>hours</w:t>
+      </w:r>
+      <w:proofErr w:type="spellEnd"/>
+      <w:r>
+        <w:rPr>
+          <w:rFonts w:cs="Times New Roman"/>
+          <w:sz w:val="24"/>
+          <w:szCs w:val="24"/>
+        </w:rPr>
+        <w:t xml:space="preserve">) → </w:t>
+      </w:r>
+      <w:proofErr w:type="spellStart"/>
+      <w:r>
+        <w:rPr>
+          <w:rFonts w:cs="Times New Roman"/>
+          <w:sz w:val="24"/>
+          <w:szCs w:val="24"/>
+        </w:rPr>
+        <w:t>int</w:t>
+      </w:r>
+      <w:proofErr w:type="spellEnd"/>
+      <w:r>
+        <w:rPr>
+          <w:rFonts w:cs="Times New Roman"/>
+          <w:sz w:val="24"/>
+          <w:szCs w:val="24"/>
+        </w:rPr>
+        <w:t xml:space="preserve"> — возвращает количество часов отдыха за неделю: 5 × 8 − </w:t>
+      </w:r>
+      <w:proofErr w:type="spellStart"/>
+      <w:r>
+        <w:rPr>
+          <w:rFonts w:cs="Times New Roman"/>
+          <w:sz w:val="24"/>
+          <w:szCs w:val="24"/>
+        </w:rPr>
+        <w:t>total</w:t>
+      </w:r>
+      <w:proofErr w:type="spellEnd"/>
+      <w:r>
+        <w:rPr>
+          <w:rFonts w:cs="Times New Roman"/>
+          <w:sz w:val="24"/>
+          <w:szCs w:val="24"/>
+        </w:rPr>
+        <w:t>, но не менее 0. Если сотрудник отработал больше нормы, возвращает 0.</w:t>
       </w:r>
     </w:p>
     <w:p>
@@ -592,7 +1585,25 @@
           <w:sz w:val="24"/>
           <w:szCs w:val="24"/>
         </w:rPr>
-        <w:t>Рисунок 1 — Activity-диаграмма (итоговая)</w:t>
+        <w:t xml:space="preserve">Рисунок 1 — </w:t>
+      </w:r>
+      <w:proofErr w:type="spellStart"/>
+      <w:r>
+        <w:rPr>
+          <w:rFonts w:cs="Times New Roman"/>
+          <w:sz w:val="24"/>
+          <w:szCs w:val="24"/>
+        </w:rPr>
+        <w:t>Activity</w:t>
+      </w:r>
+      <w:proofErr w:type="spellEnd"/>
+      <w:r>
+        <w:rPr>
+          <w:rFonts w:cs="Times New Roman"/>
+          <w:sz w:val="24"/>
+          <w:szCs w:val="24"/>
+        </w:rPr>
+        <w:t>-диаграмма (итоговая)</w:t>
       </w:r>
     </w:p>
     <w:p>
@@ -677,7 +1688,115 @@
           <w:sz w:val="24"/>
           <w:szCs w:val="24"/>
         </w:rPr>
-        <w:t>По сравнению с исходной диаграммой заполнены два блока TODO. Блок n4 (TODO A1) сформулирован конкретно: «Для каждого элемента: проверить regex ^(0|[1-9][0-9]*)$ и диапазон [0, 16], преобразовать в int». Блок</w:t>
+        <w:t xml:space="preserve">По сравнению с исходной диаграммой заполнены два блока TODO. Блок n4 (TODO A1) сформулирован конкретно: «Для каждого элемента: проверить </w:t>
+      </w:r>
+      <w:proofErr w:type="spellStart"/>
+      <w:r>
+        <w:rPr>
+          <w:rFonts w:cs="Times New Roman"/>
+          <w:sz w:val="24"/>
+          <w:szCs w:val="24"/>
+        </w:rPr>
+        <w:t>regex</w:t>
+      </w:r>
+      <w:proofErr w:type="spellEnd"/>
+      <w:r>
+        <w:rPr>
+          <w:rFonts w:cs="Times New Roman"/>
+          <w:sz w:val="24"/>
+          <w:szCs w:val="24"/>
+        </w:rPr>
+        <w:t xml:space="preserve"> </w:t>
+      </w:r>
+      <w:proofErr w:type="gramStart"/>
+      <w:r>
+        <w:rPr>
+          <w:rFonts w:cs="Times New Roman"/>
+          <w:sz w:val="24"/>
+          <w:szCs w:val="24"/>
+        </w:rPr>
+        <w:t>^(</w:t>
+      </w:r>
+      <w:proofErr w:type="gramEnd"/>
+      <w:r>
+        <w:rPr>
+          <w:rFonts w:cs="Times New Roman"/>
+          <w:sz w:val="24"/>
+          <w:szCs w:val="24"/>
+        </w:rPr>
+        <w:t>0</w:t>
+      </w:r>
+      <w:proofErr w:type="gramStart"/>
+      <w:r>
+        <w:rPr>
+          <w:rFonts w:cs="Times New Roman"/>
+          <w:sz w:val="24"/>
+          <w:szCs w:val="24"/>
+        </w:rPr>
+        <w:t>|[</w:t>
+      </w:r>
+      <w:proofErr w:type="gramEnd"/>
+      <w:r>
+        <w:rPr>
+          <w:rFonts w:cs="Times New Roman"/>
+          <w:sz w:val="24"/>
+          <w:szCs w:val="24"/>
+        </w:rPr>
+        <w:t>1-</w:t>
+      </w:r>
+      <w:proofErr w:type="gramStart"/>
+      <w:r>
+        <w:rPr>
+          <w:rFonts w:cs="Times New Roman"/>
+          <w:sz w:val="24"/>
+          <w:szCs w:val="24"/>
+        </w:rPr>
+        <w:t>9][</w:t>
+      </w:r>
+      <w:proofErr w:type="gramEnd"/>
+      <w:r>
+        <w:rPr>
+          <w:rFonts w:cs="Times New Roman"/>
+          <w:sz w:val="24"/>
+          <w:szCs w:val="24"/>
+        </w:rPr>
+        <w:t>0-</w:t>
+      </w:r>
+      <w:proofErr w:type="gramStart"/>
+      <w:r>
+        <w:rPr>
+          <w:rFonts w:cs="Times New Roman"/>
+          <w:sz w:val="24"/>
+          <w:szCs w:val="24"/>
+        </w:rPr>
+        <w:t>9]*</w:t>
+      </w:r>
+      <w:proofErr w:type="gramEnd"/>
+      <w:r>
+        <w:rPr>
+          <w:rFonts w:cs="Times New Roman"/>
+          <w:sz w:val="24"/>
+          <w:szCs w:val="24"/>
+        </w:rPr>
+        <w:t xml:space="preserve">)$ и диапазон [0, 16], преобразовать в </w:t>
+      </w:r>
+      <w:proofErr w:type="spellStart"/>
+      <w:r>
+        <w:rPr>
+          <w:rFonts w:cs="Times New Roman"/>
+          <w:sz w:val="24"/>
+          <w:szCs w:val="24"/>
+        </w:rPr>
+        <w:t>int</w:t>
+      </w:r>
+      <w:proofErr w:type="spellEnd"/>
+      <w:r>
+        <w:rPr>
+          <w:rFonts w:cs="Times New Roman"/>
+          <w:sz w:val="24"/>
+          <w:szCs w:val="24"/>
+        </w:rPr>
+        <w:t>». Блок</w:t>
       </w:r>
       <w:r>
         <w:rPr>
@@ -703,15 +1822,111 @@
           <w:szCs w:val="24"/>
           <w:lang w:val="en-US"/>
         </w:rPr>
-        <w:t xml:space="preserve">), overtimeDays (&gt;8), weeklyOvertime = max(0, 40 − sum)». </w:t>
-      </w:r>
-      <w:r>
-        <w:rPr>
-          <w:rFonts w:cs="Times New Roman"/>
-          <w:sz w:val="24"/>
-          <w:szCs w:val="24"/>
-        </w:rPr>
-        <w:t>Цикл обработки массива находится в блоке n4 и соответствует циклу for в методе parseHours. Ветвления n3 и n5 соответствуют проверкам структуры и диапазона; при ошибке управление переходит в блок n8.</w:t>
+        <w:t xml:space="preserve">), </w:t>
+      </w:r>
+      <w:proofErr w:type="spellStart"/>
+      <w:r>
+        <w:rPr>
+          <w:rFonts w:cs="Times New Roman"/>
+          <w:sz w:val="24"/>
+          <w:szCs w:val="24"/>
+          <w:lang w:val="en-US"/>
+        </w:rPr>
+        <w:t>overtimeDays</w:t>
+      </w:r>
+      <w:proofErr w:type="spellEnd"/>
+      <w:r>
+        <w:rPr>
+          <w:rFonts w:cs="Times New Roman"/>
+          <w:sz w:val="24"/>
+          <w:szCs w:val="24"/>
+          <w:lang w:val="en-US"/>
+        </w:rPr>
+        <w:t xml:space="preserve"> (&gt;8), </w:t>
+      </w:r>
+      <w:proofErr w:type="spellStart"/>
+      <w:r>
+        <w:rPr>
+          <w:rFonts w:cs="Times New Roman"/>
+          <w:sz w:val="24"/>
+          <w:szCs w:val="24"/>
+          <w:lang w:val="en-US"/>
+        </w:rPr>
+        <w:t>weeklyOvertime</w:t>
+      </w:r>
+      <w:proofErr w:type="spellEnd"/>
+      <w:r>
+        <w:rPr>
+          <w:rFonts w:cs="Times New Roman"/>
+          <w:sz w:val="24"/>
+          <w:szCs w:val="24"/>
+          <w:lang w:val="en-US"/>
+        </w:rPr>
+        <w:t xml:space="preserve"> = </w:t>
+      </w:r>
+      <w:proofErr w:type="gramStart"/>
+      <w:r>
+        <w:rPr>
+          <w:rFonts w:cs="Times New Roman"/>
+          <w:sz w:val="24"/>
+          <w:szCs w:val="24"/>
+          <w:lang w:val="en-US"/>
+        </w:rPr>
+        <w:t>max(</w:t>
+      </w:r>
+      <w:proofErr w:type="gramEnd"/>
+      <w:r>
+        <w:rPr>
+          <w:rFonts w:cs="Times New Roman"/>
+          <w:sz w:val="24"/>
+          <w:szCs w:val="24"/>
+          <w:lang w:val="en-US"/>
+        </w:rPr>
+        <w:t xml:space="preserve">0, 40 − sum)». </w:t>
+      </w:r>
+      <w:r>
+        <w:rPr>
+          <w:rFonts w:cs="Times New Roman"/>
+          <w:sz w:val="24"/>
+          <w:szCs w:val="24"/>
+        </w:rPr>
+        <w:t xml:space="preserve">Цикл обработки массива находится в блоке n4 и соответствует циклу </w:t>
+      </w:r>
+      <w:proofErr w:type="spellStart"/>
+      <w:r>
+        <w:rPr>
+          <w:rFonts w:cs="Times New Roman"/>
+          <w:sz w:val="24"/>
+          <w:szCs w:val="24"/>
+        </w:rPr>
+        <w:t>for</w:t>
+      </w:r>
+      <w:proofErr w:type="spellEnd"/>
+      <w:r>
+        <w:rPr>
+          <w:rFonts w:cs="Times New Roman"/>
+          <w:sz w:val="24"/>
+          <w:szCs w:val="24"/>
+        </w:rPr>
+        <w:t xml:space="preserve"> в методе </w:t>
+      </w:r>
+      <w:proofErr w:type="spellStart"/>
+      <w:r>
+        <w:rPr>
+          <w:rFonts w:cs="Times New Roman"/>
+          <w:sz w:val="24"/>
+          <w:szCs w:val="24"/>
+        </w:rPr>
+        <w:t>parseHours</w:t>
+      </w:r>
+      <w:proofErr w:type="spellEnd"/>
+      <w:r>
+        <w:rPr>
+          <w:rFonts w:cs="Times New Roman"/>
+          <w:sz w:val="24"/>
+          <w:szCs w:val="24"/>
+        </w:rPr>
+        <w:t>. Ветвления n3 и n5 соответствуют проверкам структуры и диапазона; при ошибке управление переходит в блок n8.</w:t>
       </w:r>
     </w:p>
     <w:p>
@@ -796,7 +2011,107 @@
           <w:sz w:val="24"/>
           <w:szCs w:val="24"/>
         </w:rPr>
-        <w:t>По сравнению с исходной диаграммой добавлен один метод — addRestHours(int[]): int (часть Б варианта 3). Сигнатуры остальных пяти методов не изменились. Итого класс TimesheetAnalyzer содержит 6 публичных статических методов. Класс SelfCheck является тестовым раннером и точкой входа, бизнес-логики не содержит.</w:t>
+        <w:t xml:space="preserve">По сравнению с исходной диаграммой добавлен один метод — </w:t>
+      </w:r>
+      <w:proofErr w:type="spellStart"/>
+      <w:r>
+        <w:rPr>
+          <w:rFonts w:cs="Times New Roman"/>
+          <w:sz w:val="24"/>
+          <w:szCs w:val="24"/>
+        </w:rPr>
+        <w:t>addRestHours</w:t>
+      </w:r>
+      <w:proofErr w:type="spellEnd"/>
+      <w:r>
+        <w:rPr>
+          <w:rFonts w:cs="Times New Roman"/>
+          <w:sz w:val="24"/>
+          <w:szCs w:val="24"/>
+        </w:rPr>
+        <w:t>(</w:t>
+      </w:r>
+      <w:proofErr w:type="spellStart"/>
+      <w:proofErr w:type="gramStart"/>
+      <w:r>
+        <w:rPr>
+          <w:rFonts w:cs="Times New Roman"/>
+          <w:sz w:val="24"/>
+          <w:szCs w:val="24"/>
+        </w:rPr>
+        <w:t>int</w:t>
+      </w:r>
+      <w:proofErr w:type="spellEnd"/>
+      <w:r>
+        <w:rPr>
+          <w:rFonts w:cs="Times New Roman"/>
+          <w:sz w:val="24"/>
+          <w:szCs w:val="24"/>
+        </w:rPr>
+        <w:t>[</w:t>
+      </w:r>
+      <w:proofErr w:type="gramEnd"/>
+      <w:r>
+        <w:rPr>
+          <w:rFonts w:cs="Times New Roman"/>
+          <w:sz w:val="24"/>
+          <w:szCs w:val="24"/>
+        </w:rPr>
+        <w:t xml:space="preserve">]): </w:t>
+      </w:r>
+      <w:proofErr w:type="spellStart"/>
+      <w:r>
+        <w:rPr>
+          <w:rFonts w:cs="Times New Roman"/>
+          <w:sz w:val="24"/>
+          <w:szCs w:val="24"/>
+        </w:rPr>
+        <w:t>int</w:t>
+      </w:r>
+      <w:proofErr w:type="spellEnd"/>
+      <w:r>
+        <w:rPr>
+          <w:rFonts w:cs="Times New Roman"/>
+          <w:sz w:val="24"/>
+          <w:szCs w:val="24"/>
+        </w:rPr>
+        <w:t xml:space="preserve"> (часть Б варианта 3). Сигнатуры остальных пяти методов не изменились. Итого класс </w:t>
+      </w:r>
+      <w:proofErr w:type="spellStart"/>
+      <w:r>
+        <w:rPr>
+          <w:rFonts w:cs="Times New Roman"/>
+          <w:sz w:val="24"/>
+          <w:szCs w:val="24"/>
+        </w:rPr>
+        <w:t>TimesheetAnalyzer</w:t>
+      </w:r>
+      <w:proofErr w:type="spellEnd"/>
+      <w:r>
+        <w:rPr>
+          <w:rFonts w:cs="Times New Roman"/>
+          <w:sz w:val="24"/>
+          <w:szCs w:val="24"/>
+        </w:rPr>
+        <w:t xml:space="preserve"> содержит 6 публичных статических методов. Класс </w:t>
+      </w:r>
+      <w:proofErr w:type="spellStart"/>
+      <w:r>
+        <w:rPr>
+          <w:rFonts w:cs="Times New Roman"/>
+          <w:sz w:val="24"/>
+          <w:szCs w:val="24"/>
+        </w:rPr>
+        <w:t>SelfCheck</w:t>
+      </w:r>
+      <w:proofErr w:type="spellEnd"/>
+      <w:r>
+        <w:rPr>
+          <w:rFonts w:cs="Times New Roman"/>
+          <w:sz w:val="24"/>
+          <w:szCs w:val="24"/>
+        </w:rPr>
+        <w:t xml:space="preserve"> является тестовым раннером и точкой входа, бизнес-логики не содержит.</w:t>
       </w:r>
     </w:p>
     <w:p>
@@ -962,7 +2277,107 @@
           <w:sz w:val="24"/>
           <w:szCs w:val="24"/>
         </w:rPr>
-        <w:t>По сравнению с исходной диаграммой добавлен один метод — addRestHours(int[]): int (часть Б варианта 3). Сигнатуры остальных пяти методов не изменились. Итого класс TimesheetAnalyzer содержит 6 публичных статических методов. Класс SelfCheck является тестовым раннером и точкой входа, бизнес-логики не содержит.</w:t>
+        <w:t xml:space="preserve">По сравнению с исходной диаграммой добавлен один метод — </w:t>
+      </w:r>
+      <w:proofErr w:type="spellStart"/>
+      <w:r>
+        <w:rPr>
+          <w:rFonts w:cs="Times New Roman"/>
+          <w:sz w:val="24"/>
+          <w:szCs w:val="24"/>
+        </w:rPr>
+        <w:t>addRestHours</w:t>
+      </w:r>
+      <w:proofErr w:type="spellEnd"/>
+      <w:r>
+        <w:rPr>
+          <w:rFonts w:cs="Times New Roman"/>
+          <w:sz w:val="24"/>
+          <w:szCs w:val="24"/>
+        </w:rPr>
+        <w:t>(</w:t>
+      </w:r>
+      <w:proofErr w:type="spellStart"/>
+      <w:proofErr w:type="gramStart"/>
+      <w:r>
+        <w:rPr>
+          <w:rFonts w:cs="Times New Roman"/>
+          <w:sz w:val="24"/>
+          <w:szCs w:val="24"/>
+        </w:rPr>
+        <w:t>int</w:t>
+      </w:r>
+      <w:proofErr w:type="spellEnd"/>
+      <w:r>
+        <w:rPr>
+          <w:rFonts w:cs="Times New Roman"/>
+          <w:sz w:val="24"/>
+          <w:szCs w:val="24"/>
+        </w:rPr>
+        <w:t>[</w:t>
+      </w:r>
+      <w:proofErr w:type="gramEnd"/>
+      <w:r>
+        <w:rPr>
+          <w:rFonts w:cs="Times New Roman"/>
+          <w:sz w:val="24"/>
+          <w:szCs w:val="24"/>
+        </w:rPr>
+        <w:t xml:space="preserve">]): </w:t>
+      </w:r>
+      <w:proofErr w:type="spellStart"/>
+      <w:r>
+        <w:rPr>
+          <w:rFonts w:cs="Times New Roman"/>
+          <w:sz w:val="24"/>
+          <w:szCs w:val="24"/>
+        </w:rPr>
+        <w:t>int</w:t>
+      </w:r>
+      <w:proofErr w:type="spellEnd"/>
+      <w:r>
+        <w:rPr>
+          <w:rFonts w:cs="Times New Roman"/>
+          <w:sz w:val="24"/>
+          <w:szCs w:val="24"/>
+        </w:rPr>
+        <w:t xml:space="preserve"> (часть Б варианта 3). Сигнатуры остальных пяти методов не изменились. Итого класс </w:t>
+      </w:r>
+      <w:proofErr w:type="spellStart"/>
+      <w:r>
+        <w:rPr>
+          <w:rFonts w:cs="Times New Roman"/>
+          <w:sz w:val="24"/>
+          <w:szCs w:val="24"/>
+        </w:rPr>
+        <w:t>TimesheetAnalyzer</w:t>
+      </w:r>
+      <w:proofErr w:type="spellEnd"/>
+      <w:r>
+        <w:rPr>
+          <w:rFonts w:cs="Times New Roman"/>
+          <w:sz w:val="24"/>
+          <w:szCs w:val="24"/>
+        </w:rPr>
+        <w:t xml:space="preserve"> содержит 6 публичных статических методов. Класс </w:t>
+      </w:r>
+      <w:proofErr w:type="spellStart"/>
+      <w:r>
+        <w:rPr>
+          <w:rFonts w:cs="Times New Roman"/>
+          <w:sz w:val="24"/>
+          <w:szCs w:val="24"/>
+        </w:rPr>
+        <w:t>SelfCheck</w:t>
+      </w:r>
+      <w:proofErr w:type="spellEnd"/>
+      <w:r>
+        <w:rPr>
+          <w:rFonts w:cs="Times New Roman"/>
+          <w:sz w:val="24"/>
+          <w:szCs w:val="24"/>
+        </w:rPr>
+        <w:t xml:space="preserve"> является тестовым раннером и точкой входа, бизнес-логики не содержит.</w:t>
       </w:r>
     </w:p>
     <w:p>
@@ -1370,35 +2785,117 @@
           <w:sz w:val="24"/>
           <w:szCs w:val="24"/>
         </w:rPr>
-        <w:t>Рисунок 3 — Вывод SelfCheck</w:t>
-      </w:r>
-    </w:p>
-    <w:p>
-      <w:pPr>
-        <w:spacing w:after="0" w:line="360" w:lineRule="auto"/>
-        <w:rPr>
-          <w:rFonts w:cs="Times New Roman"/>
-          <w:sz w:val="24"/>
-          <w:szCs w:val="24"/>
-        </w:rPr>
-      </w:pPr>
-    </w:p>
-    <w:p>
-      <w:pPr>
-        <w:spacing w:after="0" w:line="360" w:lineRule="auto"/>
-        <w:rPr>
-          <w:rFonts w:cs="Times New Roman"/>
-          <w:sz w:val="24"/>
-          <w:szCs w:val="24"/>
-        </w:rPr>
-      </w:pPr>
-      <w:r>
-        <w:rPr>
-          <w:rFonts w:cs="Times New Roman"/>
-          <w:sz w:val="24"/>
-          <w:szCs w:val="24"/>
-        </w:rPr>
-        <w:t xml:space="preserve">Всего выполнено 23 unit-проверки и 17 data-driven проверок из файла data/sample.csv. Все проверки пройдены (failed=0). Покрыты: корректная строка, пустая строка, значение 17 </w:t>
+        <w:t xml:space="preserve">Рисунок 3 — Вывод </w:t>
+      </w:r>
+      <w:proofErr w:type="spellStart"/>
+      <w:r>
+        <w:rPr>
+          <w:rFonts w:cs="Times New Roman"/>
+          <w:sz w:val="24"/>
+          <w:szCs w:val="24"/>
+        </w:rPr>
+        <w:t>SelfCheck</w:t>
+      </w:r>
+      <w:proofErr w:type="spellEnd"/>
+    </w:p>
+    <w:p>
+      <w:pPr>
+        <w:spacing w:after="0" w:line="360" w:lineRule="auto"/>
+        <w:rPr>
+          <w:rFonts w:cs="Times New Roman"/>
+          <w:sz w:val="24"/>
+          <w:szCs w:val="24"/>
+        </w:rPr>
+      </w:pPr>
+    </w:p>
+    <w:p>
+      <w:pPr>
+        <w:spacing w:after="0" w:line="360" w:lineRule="auto"/>
+        <w:rPr>
+          <w:rFonts w:cs="Times New Roman"/>
+          <w:sz w:val="24"/>
+          <w:szCs w:val="24"/>
+        </w:rPr>
+      </w:pPr>
+      <w:r>
+        <w:rPr>
+          <w:rFonts w:cs="Times New Roman"/>
+          <w:sz w:val="24"/>
+          <w:szCs w:val="24"/>
+        </w:rPr>
+        <w:t xml:space="preserve">Всего выполнено 23 </w:t>
+      </w:r>
+      <w:proofErr w:type="spellStart"/>
+      <w:r>
+        <w:rPr>
+          <w:rFonts w:cs="Times New Roman"/>
+          <w:sz w:val="24"/>
+          <w:szCs w:val="24"/>
+        </w:rPr>
+        <w:t>unit</w:t>
+      </w:r>
+      <w:proofErr w:type="spellEnd"/>
+      <w:r>
+        <w:rPr>
+          <w:rFonts w:cs="Times New Roman"/>
+          <w:sz w:val="24"/>
+          <w:szCs w:val="24"/>
+        </w:rPr>
+        <w:t xml:space="preserve">-проверки и 17 </w:t>
+      </w:r>
+      <w:proofErr w:type="spellStart"/>
+      <w:r>
+        <w:rPr>
+          <w:rFonts w:cs="Times New Roman"/>
+          <w:sz w:val="24"/>
+          <w:szCs w:val="24"/>
+        </w:rPr>
+        <w:t>data-driven</w:t>
+      </w:r>
+      <w:proofErr w:type="spellEnd"/>
+      <w:r>
+        <w:rPr>
+          <w:rFonts w:cs="Times New Roman"/>
+          <w:sz w:val="24"/>
+          <w:szCs w:val="24"/>
+        </w:rPr>
+        <w:t xml:space="preserve"> проверок из файла </w:t>
+      </w:r>
+      <w:proofErr w:type="spellStart"/>
+      <w:r>
+        <w:rPr>
+          <w:rFonts w:cs="Times New Roman"/>
+          <w:sz w:val="24"/>
+          <w:szCs w:val="24"/>
+        </w:rPr>
+        <w:t>data</w:t>
+      </w:r>
+      <w:proofErr w:type="spellEnd"/>
+      <w:r>
+        <w:rPr>
+          <w:rFonts w:cs="Times New Roman"/>
+          <w:sz w:val="24"/>
+          <w:szCs w:val="24"/>
+        </w:rPr>
+        <w:t>/sample.csv. Все проверки пройдены (</w:t>
+      </w:r>
+      <w:proofErr w:type="spellStart"/>
+      <w:r>
+        <w:rPr>
+          <w:rFonts w:cs="Times New Roman"/>
+          <w:sz w:val="24"/>
+          <w:szCs w:val="24"/>
+        </w:rPr>
+        <w:t>failed</w:t>
+      </w:r>
+      <w:proofErr w:type="spellEnd"/>
+      <w:r>
+        <w:rPr>
+          <w:rFonts w:cs="Times New Roman"/>
+          <w:sz w:val="24"/>
+          <w:szCs w:val="24"/>
+        </w:rPr>
+        <w:t xml:space="preserve">=0). Покрыты: корректная строка, пустая строка, значение 17 </w:t>
       </w:r>
       <w:r>
         <w:rPr>
@@ -1407,7 +2904,125 @@
           <w:szCs w:val="24"/>
         </w:rPr>
         <w:lastRenderedPageBreak/>
-        <w:t>(верхняя граница + 1), не-число, 4 значения, trailing «;», ведущий ноль, пустое поле, surrounding-пробел, границы 0 и 16, дробное значение 8.5. Для варианта 3 добавлены проверки недоработки (weeklyOvertime = max(0, 40 − sum)) и addRestHours.</w:t>
+        <w:t xml:space="preserve">(верхняя граница + 1), не-число, 4 значения, </w:t>
+      </w:r>
+      <w:proofErr w:type="spellStart"/>
+      <w:r>
+        <w:rPr>
+          <w:rFonts w:cs="Times New Roman"/>
+          <w:sz w:val="24"/>
+          <w:szCs w:val="24"/>
+        </w:rPr>
+        <w:t>trailing</w:t>
+      </w:r>
+      <w:proofErr w:type="spellEnd"/>
+      <w:r>
+        <w:rPr>
+          <w:rFonts w:cs="Times New Roman"/>
+          <w:sz w:val="24"/>
+          <w:szCs w:val="24"/>
+        </w:rPr>
+        <w:t xml:space="preserve"> «;», ведущий ноль, пустое поле, </w:t>
+      </w:r>
+      <w:proofErr w:type="spellStart"/>
+      <w:r>
+        <w:rPr>
+          <w:rFonts w:cs="Times New Roman"/>
+          <w:sz w:val="24"/>
+          <w:szCs w:val="24"/>
+        </w:rPr>
+        <w:t>surrounding</w:t>
+      </w:r>
+      <w:proofErr w:type="spellEnd"/>
+      <w:r>
+        <w:rPr>
+          <w:rFonts w:cs="Times New Roman"/>
+          <w:sz w:val="24"/>
+          <w:szCs w:val="24"/>
+        </w:rPr>
+        <w:t>-пробел, границы 0 и 16, дробное значение 8.5. Для варианта 3 добавлены проверки недоработки (</w:t>
+      </w:r>
+      <w:proofErr w:type="spellStart"/>
+      <w:r>
+        <w:rPr>
+          <w:rFonts w:cs="Times New Roman"/>
+          <w:sz w:val="24"/>
+          <w:szCs w:val="24"/>
+        </w:rPr>
+        <w:t>weeklyOvertime</w:t>
+      </w:r>
+      <w:proofErr w:type="spellEnd"/>
+      <w:r>
+        <w:rPr>
+          <w:rFonts w:cs="Times New Roman"/>
+          <w:sz w:val="24"/>
+          <w:szCs w:val="24"/>
+        </w:rPr>
+        <w:t xml:space="preserve"> = </w:t>
+      </w:r>
+      <w:proofErr w:type="spellStart"/>
+      <w:proofErr w:type="gramStart"/>
+      <w:r>
+        <w:rPr>
+          <w:rFonts w:cs="Times New Roman"/>
+          <w:sz w:val="24"/>
+          <w:szCs w:val="24"/>
+        </w:rPr>
+        <w:t>max</w:t>
+      </w:r>
+      <w:proofErr w:type="spellEnd"/>
+      <w:r>
+        <w:rPr>
+          <w:rFonts w:cs="Times New Roman"/>
+          <w:sz w:val="24"/>
+          <w:szCs w:val="24"/>
+        </w:rPr>
+        <w:t>(</w:t>
+      </w:r>
+      <w:proofErr w:type="gramEnd"/>
+      <w:r>
+        <w:rPr>
+          <w:rFonts w:cs="Times New Roman"/>
+          <w:sz w:val="24"/>
+          <w:szCs w:val="24"/>
+        </w:rPr>
+        <w:t xml:space="preserve">0, 40 − </w:t>
+      </w:r>
+      <w:proofErr w:type="spellStart"/>
+      <w:r>
+        <w:rPr>
+          <w:rFonts w:cs="Times New Roman"/>
+          <w:sz w:val="24"/>
+          <w:szCs w:val="24"/>
+        </w:rPr>
+        <w:t>sum</w:t>
+      </w:r>
+      <w:proofErr w:type="spellEnd"/>
+      <w:r>
+        <w:rPr>
+          <w:rFonts w:cs="Times New Roman"/>
+          <w:sz w:val="24"/>
+          <w:szCs w:val="24"/>
+        </w:rPr>
+        <w:t xml:space="preserve">)) и </w:t>
+      </w:r>
+      <w:proofErr w:type="spellStart"/>
+      <w:r>
+        <w:rPr>
+          <w:rFonts w:cs="Times New Roman"/>
+          <w:sz w:val="24"/>
+          <w:szCs w:val="24"/>
+        </w:rPr>
+        <w:t>addRestHours</w:t>
+      </w:r>
+      <w:proofErr w:type="spellEnd"/>
+      <w:r>
+        <w:rPr>
+          <w:rFonts w:cs="Times New Roman"/>
+          <w:sz w:val="24"/>
+          <w:szCs w:val="24"/>
+        </w:rPr>
+        <w:t>.</w:t>
       </w:r>
     </w:p>
     <w:p>
@@ -1465,6 +3080,7 @@
           <w:rFonts w:cs="Times New Roman"/>
           <w:sz w:val="24"/>
           <w:szCs w:val="24"/>
+          <w:lang w:val="en-US"/>
         </w:rPr>
       </w:pPr>
       <w:r>
@@ -1509,6 +3125,7 @@
         </w:rPr>
         <w:t xml:space="preserve"> </w:t>
       </w:r>
+      <w:proofErr w:type="spellStart"/>
       <w:r>
         <w:rPr>
           <w:rFonts w:cs="Times New Roman"/>
@@ -1518,6 +3135,7 @@
         </w:rPr>
         <w:t>i</w:t>
       </w:r>
+      <w:proofErr w:type="spellEnd"/>
       <w:r>
         <w:rPr>
           <w:rFonts w:cs="Times New Roman"/>
@@ -1526,6 +3144,7 @@
         </w:rPr>
         <w:t xml:space="preserve"> = 0; </w:t>
       </w:r>
+      <w:proofErr w:type="spellStart"/>
       <w:r>
         <w:rPr>
           <w:rFonts w:cs="Times New Roman"/>
@@ -1535,6 +3154,7 @@
         </w:rPr>
         <w:t>i</w:t>
       </w:r>
+      <w:proofErr w:type="spellEnd"/>
       <w:r>
         <w:rPr>
           <w:rFonts w:cs="Times New Roman"/>
@@ -1543,6 +3163,7 @@
         </w:rPr>
         <w:t xml:space="preserve"> &lt;= </w:t>
       </w:r>
+      <w:proofErr w:type="gramStart"/>
       <w:r>
         <w:rPr>
           <w:rFonts w:cs="Times New Roman"/>
@@ -1569,6 +3190,7 @@
         </w:rPr>
         <w:t>length</w:t>
       </w:r>
+      <w:proofErr w:type="gramEnd"/>
       <w:r>
         <w:rPr>
           <w:rFonts w:cs="Times New Roman"/>
@@ -1577,6 +3199,7 @@
         </w:rPr>
         <w:t xml:space="preserve">; </w:t>
       </w:r>
+      <w:proofErr w:type="spellStart"/>
       <w:r>
         <w:rPr>
           <w:rFonts w:cs="Times New Roman"/>
@@ -1586,13 +3209,23 @@
         </w:rPr>
         <w:t>i</w:t>
       </w:r>
-      <w:r>
-        <w:rPr>
-          <w:rFonts w:cs="Times New Roman"/>
-          <w:sz w:val="24"/>
-          <w:szCs w:val="24"/>
-        </w:rPr>
-        <w:t xml:space="preserve">++) { </w:t>
+      <w:proofErr w:type="spellEnd"/>
+      <w:r>
+        <w:rPr>
+          <w:rFonts w:cs="Times New Roman"/>
+          <w:sz w:val="24"/>
+          <w:szCs w:val="24"/>
+        </w:rPr>
+        <w:t xml:space="preserve">++) </w:t>
+      </w:r>
+      <w:proofErr w:type="gramStart"/>
+      <w:r>
+        <w:rPr>
+          <w:rFonts w:cs="Times New Roman"/>
+          <w:sz w:val="24"/>
+          <w:szCs w:val="24"/>
+        </w:rPr>
+        <w:t xml:space="preserve">{ </w:t>
       </w:r>
       <w:r>
         <w:rPr>
@@ -1603,6 +3236,7 @@
         </w:rPr>
         <w:t>total</w:t>
       </w:r>
+      <w:proofErr w:type="gramEnd"/>
       <w:r>
         <w:rPr>
           <w:rFonts w:cs="Times New Roman"/>
@@ -1628,6 +3262,7 @@
         </w:rPr>
         <w:t>[</w:t>
       </w:r>
+      <w:proofErr w:type="spellStart"/>
       <w:r>
         <w:rPr>
           <w:rFonts w:cs="Times New Roman"/>
@@ -1637,13 +3272,32 @@
         </w:rPr>
         <w:t>i</w:t>
       </w:r>
-      <w:r>
-        <w:rPr>
-          <w:rFonts w:cs="Times New Roman"/>
-          <w:sz w:val="24"/>
-          <w:szCs w:val="24"/>
-        </w:rPr>
-        <w:t xml:space="preserve">]; } допущена ошибка </w:t>
+      <w:proofErr w:type="spellEnd"/>
+      <w:r>
+        <w:rPr>
+          <w:rFonts w:cs="Times New Roman"/>
+          <w:sz w:val="24"/>
+          <w:szCs w:val="24"/>
+        </w:rPr>
+        <w:t>]</w:t>
+      </w:r>
+      <w:proofErr w:type="gramStart"/>
+      <w:r>
+        <w:rPr>
+          <w:rFonts w:cs="Times New Roman"/>
+          <w:sz w:val="24"/>
+          <w:szCs w:val="24"/>
+        </w:rPr>
+        <w:t>; }</w:t>
+      </w:r>
+      <w:proofErr w:type="gramEnd"/>
+      <w:r>
+        <w:rPr>
+          <w:rFonts w:cs="Times New Roman"/>
+          <w:sz w:val="24"/>
+          <w:szCs w:val="24"/>
+        </w:rPr>
+        <w:t xml:space="preserve"> допущена ошибка </w:t>
       </w:r>
       <w:r>
         <w:rPr>
@@ -1696,6 +3350,7 @@
         </w:rPr>
         <w:t xml:space="preserve">: условие </w:t>
       </w:r>
+      <w:proofErr w:type="spellStart"/>
       <w:r>
         <w:rPr>
           <w:rFonts w:cs="Times New Roman"/>
@@ -1705,6 +3360,7 @@
         </w:rPr>
         <w:t>i</w:t>
       </w:r>
+      <w:proofErr w:type="spellEnd"/>
       <w:r>
         <w:rPr>
           <w:rFonts w:cs="Times New Roman"/>
@@ -1713,6 +3369,7 @@
         </w:rPr>
         <w:t xml:space="preserve"> &lt;= </w:t>
       </w:r>
+      <w:proofErr w:type="gramStart"/>
       <w:r>
         <w:rPr>
           <w:rFonts w:cs="Times New Roman"/>
@@ -1739,6 +3396,7 @@
         </w:rPr>
         <w:t>length</w:t>
       </w:r>
+      <w:proofErr w:type="gramEnd"/>
       <w:r>
         <w:rPr>
           <w:rFonts w:cs="Times New Roman"/>
@@ -1747,6 +3405,7 @@
         </w:rPr>
         <w:t xml:space="preserve"> позволяет индексу </w:t>
       </w:r>
+      <w:proofErr w:type="spellStart"/>
       <w:r>
         <w:rPr>
           <w:rFonts w:cs="Times New Roman"/>
@@ -1756,14 +3415,34 @@
         </w:rPr>
         <w:t>i</w:t>
       </w:r>
-      <w:r>
-        <w:rPr>
-          <w:rFonts w:cs="Times New Roman"/>
-          <w:sz w:val="24"/>
-          <w:szCs w:val="24"/>
-        </w:rPr>
-        <w:t xml:space="preserve"> принять значение 5, тогда как в массиве из 5 элементов допустимы индексы 0..4. На итерации </w:t>
-      </w:r>
+      <w:proofErr w:type="spellEnd"/>
+      <w:r>
+        <w:rPr>
+          <w:rFonts w:cs="Times New Roman"/>
+          <w:sz w:val="24"/>
+          <w:szCs w:val="24"/>
+        </w:rPr>
+        <w:t xml:space="preserve"> принять значение 5, тогда как в массиве из 5 элементов допустимы индексы </w:t>
+      </w:r>
+      <w:proofErr w:type="gramStart"/>
+      <w:r>
+        <w:rPr>
+          <w:rFonts w:cs="Times New Roman"/>
+          <w:sz w:val="24"/>
+          <w:szCs w:val="24"/>
+        </w:rPr>
+        <w:t>0..</w:t>
+      </w:r>
+      <w:proofErr w:type="gramEnd"/>
+      <w:r>
+        <w:rPr>
+          <w:rFonts w:cs="Times New Roman"/>
+          <w:sz w:val="24"/>
+          <w:szCs w:val="24"/>
+        </w:rPr>
+        <w:t xml:space="preserve">4. На итерации </w:t>
+      </w:r>
+      <w:proofErr w:type="spellStart"/>
       <w:r>
         <w:rPr>
           <w:rFonts w:cs="Times New Roman"/>
@@ -1773,6 +3452,7 @@
         </w:rPr>
         <w:t>i</w:t>
       </w:r>
+      <w:proofErr w:type="spellEnd"/>
       <w:r>
         <w:rPr>
           <w:rFonts w:cs="Times New Roman"/>
@@ -1781,6 +3461,7 @@
         </w:rPr>
         <w:t xml:space="preserve"> = 5 произойдёт </w:t>
       </w:r>
+      <w:proofErr w:type="spellStart"/>
       <w:r>
         <w:rPr>
           <w:rFonts w:cs="Times New Roman"/>
@@ -1790,6 +3471,7 @@
         </w:rPr>
         <w:t>ArrayIndexOutOfBoundsException</w:t>
       </w:r>
+      <w:proofErr w:type="spellEnd"/>
       <w:r>
         <w:rPr>
           <w:rFonts w:cs="Times New Roman"/>
@@ -1815,6 +3497,7 @@
         </w:rPr>
         <w:t xml:space="preserve">1: корректная строка из 5 значений должна обрабатываться без падения. </w:t>
       </w:r>
+      <w:proofErr w:type="spellStart"/>
       <w:r>
         <w:rPr>
           <w:rFonts w:cs="Times New Roman"/>
@@ -1822,26 +3505,220 @@
           <w:szCs w:val="24"/>
           <w:lang w:val="en-US"/>
         </w:rPr>
-        <w:t>Исправленное условие цикла: for (int i = 0; i &lt; hours.length; i++) { total += hours[i]; }.</w:t>
-      </w:r>
-    </w:p>
-    <w:p>
-      <w:pPr>
-        <w:spacing w:after="0" w:line="360" w:lineRule="auto"/>
-        <w:rPr>
-          <w:rFonts w:cs="Times New Roman"/>
-          <w:sz w:val="24"/>
-          <w:szCs w:val="24"/>
-        </w:rPr>
-      </w:pPr>
-    </w:p>
-    <w:p>
-      <w:pPr>
-        <w:spacing w:after="0" w:line="360" w:lineRule="auto"/>
-        <w:rPr>
-          <w:rFonts w:cs="Times New Roman"/>
-          <w:sz w:val="24"/>
-          <w:szCs w:val="24"/>
+        <w:t>Исправленное</w:t>
+      </w:r>
+      <w:proofErr w:type="spellEnd"/>
+      <w:r>
+        <w:rPr>
+          <w:rFonts w:cs="Times New Roman"/>
+          <w:sz w:val="24"/>
+          <w:szCs w:val="24"/>
+          <w:lang w:val="en-US"/>
+        </w:rPr>
+        <w:t xml:space="preserve"> </w:t>
+      </w:r>
+      <w:proofErr w:type="spellStart"/>
+      <w:r>
+        <w:rPr>
+          <w:rFonts w:cs="Times New Roman"/>
+          <w:sz w:val="24"/>
+          <w:szCs w:val="24"/>
+          <w:lang w:val="en-US"/>
+        </w:rPr>
+        <w:t>условие</w:t>
+      </w:r>
+      <w:proofErr w:type="spellEnd"/>
+      <w:r>
+        <w:rPr>
+          <w:rFonts w:cs="Times New Roman"/>
+          <w:sz w:val="24"/>
+          <w:szCs w:val="24"/>
+          <w:lang w:val="en-US"/>
+        </w:rPr>
+        <w:t xml:space="preserve"> </w:t>
+      </w:r>
+      <w:proofErr w:type="spellStart"/>
+      <w:r>
+        <w:rPr>
+          <w:rFonts w:cs="Times New Roman"/>
+          <w:sz w:val="24"/>
+          <w:szCs w:val="24"/>
+          <w:lang w:val="en-US"/>
+        </w:rPr>
+        <w:t>цикла</w:t>
+      </w:r>
+      <w:proofErr w:type="spellEnd"/>
+      <w:r>
+        <w:rPr>
+          <w:rFonts w:cs="Times New Roman"/>
+          <w:sz w:val="24"/>
+          <w:szCs w:val="24"/>
+          <w:lang w:val="en-US"/>
+        </w:rPr>
+        <w:t xml:space="preserve">: for (int </w:t>
+      </w:r>
+      <w:proofErr w:type="spellStart"/>
+      <w:r>
+        <w:rPr>
+          <w:rFonts w:cs="Times New Roman"/>
+          <w:sz w:val="24"/>
+          <w:szCs w:val="24"/>
+          <w:lang w:val="en-US"/>
+        </w:rPr>
+        <w:t>i</w:t>
+      </w:r>
+      <w:proofErr w:type="spellEnd"/>
+      <w:r>
+        <w:rPr>
+          <w:rFonts w:cs="Times New Roman"/>
+          <w:sz w:val="24"/>
+          <w:szCs w:val="24"/>
+          <w:lang w:val="en-US"/>
+        </w:rPr>
+        <w:t xml:space="preserve"> = 0; </w:t>
+      </w:r>
+      <w:proofErr w:type="spellStart"/>
+      <w:r>
+        <w:rPr>
+          <w:rFonts w:cs="Times New Roman"/>
+          <w:sz w:val="24"/>
+          <w:szCs w:val="24"/>
+          <w:lang w:val="en-US"/>
+        </w:rPr>
+        <w:t>i</w:t>
+      </w:r>
+      <w:proofErr w:type="spellEnd"/>
+      <w:r>
+        <w:rPr>
+          <w:rFonts w:cs="Times New Roman"/>
+          <w:sz w:val="24"/>
+          <w:szCs w:val="24"/>
+          <w:lang w:val="en-US"/>
+        </w:rPr>
+        <w:t xml:space="preserve"> &lt; </w:t>
+      </w:r>
+      <w:proofErr w:type="spellStart"/>
+      <w:proofErr w:type="gramStart"/>
+      <w:r>
+        <w:rPr>
+          <w:rFonts w:cs="Times New Roman"/>
+          <w:sz w:val="24"/>
+          <w:szCs w:val="24"/>
+          <w:lang w:val="en-US"/>
+        </w:rPr>
+        <w:t>hours.length</w:t>
+      </w:r>
+      <w:proofErr w:type="spellEnd"/>
+      <w:proofErr w:type="gramEnd"/>
+      <w:r>
+        <w:rPr>
+          <w:rFonts w:cs="Times New Roman"/>
+          <w:sz w:val="24"/>
+          <w:szCs w:val="24"/>
+          <w:lang w:val="en-US"/>
+        </w:rPr>
+        <w:t xml:space="preserve">; </w:t>
+      </w:r>
+      <w:proofErr w:type="spellStart"/>
+      <w:r>
+        <w:rPr>
+          <w:rFonts w:cs="Times New Roman"/>
+          <w:sz w:val="24"/>
+          <w:szCs w:val="24"/>
+          <w:lang w:val="en-US"/>
+        </w:rPr>
+        <w:t>i</w:t>
+      </w:r>
+      <w:proofErr w:type="spellEnd"/>
+      <w:r>
+        <w:rPr>
+          <w:rFonts w:cs="Times New Roman"/>
+          <w:sz w:val="24"/>
+          <w:szCs w:val="24"/>
+          <w:lang w:val="en-US"/>
+        </w:rPr>
+        <w:t xml:space="preserve">++) </w:t>
+      </w:r>
+      <w:proofErr w:type="gramStart"/>
+      <w:r>
+        <w:rPr>
+          <w:rFonts w:cs="Times New Roman"/>
+          <w:sz w:val="24"/>
+          <w:szCs w:val="24"/>
+          <w:lang w:val="en-US"/>
+        </w:rPr>
+        <w:t>{ total</w:t>
+      </w:r>
+      <w:proofErr w:type="gramEnd"/>
+      <w:r>
+        <w:rPr>
+          <w:rFonts w:cs="Times New Roman"/>
+          <w:sz w:val="24"/>
+          <w:szCs w:val="24"/>
+          <w:lang w:val="en-US"/>
+        </w:rPr>
+        <w:t xml:space="preserve"> += hours[</w:t>
+      </w:r>
+      <w:proofErr w:type="spellStart"/>
+      <w:r>
+        <w:rPr>
+          <w:rFonts w:cs="Times New Roman"/>
+          <w:sz w:val="24"/>
+          <w:szCs w:val="24"/>
+          <w:lang w:val="en-US"/>
+        </w:rPr>
+        <w:t>i</w:t>
+      </w:r>
+      <w:proofErr w:type="spellEnd"/>
+      <w:r>
+        <w:rPr>
+          <w:rFonts w:cs="Times New Roman"/>
+          <w:sz w:val="24"/>
+          <w:szCs w:val="24"/>
+          <w:lang w:val="en-US"/>
+        </w:rPr>
+        <w:t>]</w:t>
+      </w:r>
+      <w:proofErr w:type="gramStart"/>
+      <w:r>
+        <w:rPr>
+          <w:rFonts w:cs="Times New Roman"/>
+          <w:sz w:val="24"/>
+          <w:szCs w:val="24"/>
+          <w:lang w:val="en-US"/>
+        </w:rPr>
+        <w:t>; }</w:t>
+      </w:r>
+      <w:proofErr w:type="gramEnd"/>
+      <w:r>
+        <w:rPr>
+          <w:rFonts w:cs="Times New Roman"/>
+          <w:sz w:val="24"/>
+          <w:szCs w:val="24"/>
+          <w:lang w:val="en-US"/>
+        </w:rPr>
+        <w:t>.</w:t>
+      </w:r>
+    </w:p>
+    <w:p>
+      <w:pPr>
+        <w:spacing w:after="0" w:line="360" w:lineRule="auto"/>
+        <w:rPr>
+          <w:rFonts w:cs="Times New Roman"/>
+          <w:sz w:val="24"/>
+          <w:szCs w:val="24"/>
+          <w:lang w:val="en-US"/>
+        </w:rPr>
+      </w:pPr>
+    </w:p>
+    <w:p>
+      <w:pPr>
+        <w:spacing w:after="0" w:line="360" w:lineRule="auto"/>
+        <w:rPr>
+          <w:rFonts w:cs="Times New Roman"/>
+          <w:sz w:val="24"/>
+          <w:szCs w:val="24"/>
+          <w:lang w:val="en-US"/>
         </w:rPr>
       </w:pPr>
     </w:p>
@@ -1888,91 +3765,571 @@
           <w:sz w:val="24"/>
           <w:szCs w:val="24"/>
         </w:rPr>
-        <w:t>Вопрос 1. Наиболее вероятная ошибка — неверное количество значений или не-число (пользователь путает разделитель, ставит лишний «;», печатает букву). Защищает проверка parts.length != 5 и regex ^(0|[1-9][0-9]*)$ в методе parseHours класса TimesheetAnalyzer. Это единственная точка валидации ввода, до остальных методов «плохая» строка не доходит.</w:t>
-      </w:r>
-    </w:p>
-    <w:p>
-      <w:pPr>
-        <w:spacing w:after="0" w:line="360" w:lineRule="auto"/>
-        <w:rPr>
-          <w:rFonts w:cs="Times New Roman"/>
-          <w:sz w:val="24"/>
-          <w:szCs w:val="24"/>
-        </w:rPr>
-      </w:pPr>
-    </w:p>
-    <w:p>
-      <w:pPr>
-        <w:spacing w:after="0" w:line="360" w:lineRule="auto"/>
-        <w:rPr>
-          <w:rFonts w:cs="Times New Roman"/>
-          <w:sz w:val="24"/>
-          <w:szCs w:val="24"/>
-        </w:rPr>
-      </w:pPr>
-      <w:r>
-        <w:rPr>
-          <w:rFonts w:cs="Times New Roman"/>
-          <w:sz w:val="24"/>
-          <w:szCs w:val="24"/>
-        </w:rPr>
-        <w:t>Вопрос 2. Ключевое правило варианта 3 — формула недоработки max(0, 40 − sum) — содержится в TimesheetAnalyzer.weeklyOvertime и продублирована по смыслу в addRestHours. Метод чистый (без состояния, без I/O), переиспользует total, легко тестируется, а порог 40 вынесен в константу WEEKLY_NORMAL_HOURS.</w:t>
-      </w:r>
-    </w:p>
-    <w:p>
-      <w:pPr>
-        <w:spacing w:after="0" w:line="360" w:lineRule="auto"/>
-        <w:rPr>
-          <w:rFonts w:cs="Times New Roman"/>
-          <w:sz w:val="24"/>
-          <w:szCs w:val="24"/>
-        </w:rPr>
-      </w:pPr>
-    </w:p>
-    <w:p>
-      <w:pPr>
-        <w:spacing w:after="0" w:line="360" w:lineRule="auto"/>
-        <w:rPr>
-          <w:rFonts w:cs="Times New Roman"/>
-          <w:sz w:val="24"/>
-          <w:szCs w:val="24"/>
-        </w:rPr>
-      </w:pPr>
-      <w:r>
-        <w:rPr>
-          <w:rFonts w:cs="Times New Roman"/>
-          <w:sz w:val="24"/>
-          <w:szCs w:val="24"/>
-        </w:rPr>
-        <w:t>Вопрос 3. Блок n4 (бывший TODO A1) на Activity-диаграмме соответствует циклу for в parseHours: для каждого элемента проверяется regex ^(0|[1-9][0-9]*)$ и диапазон [0, 16], затем делается Integer.parseInt. Блок n3 — это проверка parts.length != DAYS_IN_WEEK, а n8 — бросок IllegalArgumentException.</w:t>
-      </w:r>
-    </w:p>
-    <w:p>
-      <w:pPr>
-        <w:spacing w:after="0" w:line="360" w:lineRule="auto"/>
-        <w:rPr>
-          <w:rFonts w:cs="Times New Roman"/>
-          <w:sz w:val="24"/>
-          <w:szCs w:val="24"/>
-        </w:rPr>
-      </w:pPr>
-    </w:p>
-    <w:p>
-      <w:pPr>
-        <w:spacing w:after="0" w:line="360" w:lineRule="auto"/>
-        <w:rPr>
-          <w:rFonts w:cs="Times New Roman"/>
-          <w:sz w:val="24"/>
-          <w:szCs w:val="24"/>
-        </w:rPr>
-      </w:pPr>
-      <w:r>
-        <w:rPr>
-          <w:rFonts w:cs="Times New Roman"/>
-          <w:sz w:val="24"/>
-          <w:szCs w:val="24"/>
-        </w:rPr>
-        <w:t xml:space="preserve">Вопрос 4. Изменение порога дневной переработки (например, 8 → 9) затронет один метод overtimeDays и одну константу DAILY_NORMAL_HOURS. Благодаря централизации </w:t>
+        <w:t xml:space="preserve">Вопрос 1. Наиболее вероятная ошибка — неверное количество значений или не-число (пользователь путает разделитель, ставит лишний «;», печатает букву). Защищает проверка </w:t>
+      </w:r>
+      <w:proofErr w:type="spellStart"/>
+      <w:proofErr w:type="gramStart"/>
+      <w:r>
+        <w:rPr>
+          <w:rFonts w:cs="Times New Roman"/>
+          <w:sz w:val="24"/>
+          <w:szCs w:val="24"/>
+        </w:rPr>
+        <w:t>parts.length</w:t>
+      </w:r>
+      <w:proofErr w:type="spellEnd"/>
+      <w:r>
+        <w:rPr>
+          <w:rFonts w:cs="Times New Roman"/>
+          <w:sz w:val="24"/>
+          <w:szCs w:val="24"/>
+        </w:rPr>
+        <w:t xml:space="preserve"> !=</w:t>
+      </w:r>
+      <w:proofErr w:type="gramEnd"/>
+      <w:r>
+        <w:rPr>
+          <w:rFonts w:cs="Times New Roman"/>
+          <w:sz w:val="24"/>
+          <w:szCs w:val="24"/>
+        </w:rPr>
+        <w:t xml:space="preserve"> 5 и </w:t>
+      </w:r>
+      <w:proofErr w:type="spellStart"/>
+      <w:r>
+        <w:rPr>
+          <w:rFonts w:cs="Times New Roman"/>
+          <w:sz w:val="24"/>
+          <w:szCs w:val="24"/>
+        </w:rPr>
+        <w:t>regex</w:t>
+      </w:r>
+      <w:proofErr w:type="spellEnd"/>
+      <w:r>
+        <w:rPr>
+          <w:rFonts w:cs="Times New Roman"/>
+          <w:sz w:val="24"/>
+          <w:szCs w:val="24"/>
+        </w:rPr>
+        <w:t xml:space="preserve"> </w:t>
+      </w:r>
+      <w:proofErr w:type="gramStart"/>
+      <w:r>
+        <w:rPr>
+          <w:rFonts w:cs="Times New Roman"/>
+          <w:sz w:val="24"/>
+          <w:szCs w:val="24"/>
+        </w:rPr>
+        <w:t>^(</w:t>
+      </w:r>
+      <w:proofErr w:type="gramEnd"/>
+      <w:r>
+        <w:rPr>
+          <w:rFonts w:cs="Times New Roman"/>
+          <w:sz w:val="24"/>
+          <w:szCs w:val="24"/>
+        </w:rPr>
+        <w:t>0</w:t>
+      </w:r>
+      <w:proofErr w:type="gramStart"/>
+      <w:r>
+        <w:rPr>
+          <w:rFonts w:cs="Times New Roman"/>
+          <w:sz w:val="24"/>
+          <w:szCs w:val="24"/>
+        </w:rPr>
+        <w:t>|[</w:t>
+      </w:r>
+      <w:proofErr w:type="gramEnd"/>
+      <w:r>
+        <w:rPr>
+          <w:rFonts w:cs="Times New Roman"/>
+          <w:sz w:val="24"/>
+          <w:szCs w:val="24"/>
+        </w:rPr>
+        <w:t>1-</w:t>
+      </w:r>
+      <w:proofErr w:type="gramStart"/>
+      <w:r>
+        <w:rPr>
+          <w:rFonts w:cs="Times New Roman"/>
+          <w:sz w:val="24"/>
+          <w:szCs w:val="24"/>
+        </w:rPr>
+        <w:t>9][</w:t>
+      </w:r>
+      <w:proofErr w:type="gramEnd"/>
+      <w:r>
+        <w:rPr>
+          <w:rFonts w:cs="Times New Roman"/>
+          <w:sz w:val="24"/>
+          <w:szCs w:val="24"/>
+        </w:rPr>
+        <w:t>0-</w:t>
+      </w:r>
+      <w:proofErr w:type="gramStart"/>
+      <w:r>
+        <w:rPr>
+          <w:rFonts w:cs="Times New Roman"/>
+          <w:sz w:val="24"/>
+          <w:szCs w:val="24"/>
+        </w:rPr>
+        <w:t>9]*</w:t>
+      </w:r>
+      <w:proofErr w:type="gramEnd"/>
+      <w:r>
+        <w:rPr>
+          <w:rFonts w:cs="Times New Roman"/>
+          <w:sz w:val="24"/>
+          <w:szCs w:val="24"/>
+        </w:rPr>
+        <w:t xml:space="preserve">)$ в методе </w:t>
+      </w:r>
+      <w:proofErr w:type="spellStart"/>
+      <w:r>
+        <w:rPr>
+          <w:rFonts w:cs="Times New Roman"/>
+          <w:sz w:val="24"/>
+          <w:szCs w:val="24"/>
+        </w:rPr>
+        <w:t>parseHours</w:t>
+      </w:r>
+      <w:proofErr w:type="spellEnd"/>
+      <w:r>
+        <w:rPr>
+          <w:rFonts w:cs="Times New Roman"/>
+          <w:sz w:val="24"/>
+          <w:szCs w:val="24"/>
+        </w:rPr>
+        <w:t xml:space="preserve"> класса </w:t>
+      </w:r>
+      <w:proofErr w:type="spellStart"/>
+      <w:r>
+        <w:rPr>
+          <w:rFonts w:cs="Times New Roman"/>
+          <w:sz w:val="24"/>
+          <w:szCs w:val="24"/>
+        </w:rPr>
+        <w:t>TimesheetAnalyzer</w:t>
+      </w:r>
+      <w:proofErr w:type="spellEnd"/>
+      <w:r>
+        <w:rPr>
+          <w:rFonts w:cs="Times New Roman"/>
+          <w:sz w:val="24"/>
+          <w:szCs w:val="24"/>
+        </w:rPr>
+        <w:t>. Это единственная точка валидации ввода, до остальных методов «плохая» строка не доходит.</w:t>
+      </w:r>
+    </w:p>
+    <w:p>
+      <w:pPr>
+        <w:spacing w:after="0" w:line="360" w:lineRule="auto"/>
+        <w:rPr>
+          <w:rFonts w:cs="Times New Roman"/>
+          <w:sz w:val="24"/>
+          <w:szCs w:val="24"/>
+        </w:rPr>
+      </w:pPr>
+    </w:p>
+    <w:p>
+      <w:pPr>
+        <w:spacing w:after="0" w:line="360" w:lineRule="auto"/>
+        <w:rPr>
+          <w:rFonts w:cs="Times New Roman"/>
+          <w:sz w:val="24"/>
+          <w:szCs w:val="24"/>
+        </w:rPr>
+      </w:pPr>
+      <w:r>
+        <w:rPr>
+          <w:rFonts w:cs="Times New Roman"/>
+          <w:sz w:val="24"/>
+          <w:szCs w:val="24"/>
+        </w:rPr>
+        <w:t xml:space="preserve">Вопрос 2. Ключевое правило варианта 3 — формула недоработки </w:t>
+      </w:r>
+      <w:proofErr w:type="spellStart"/>
+      <w:proofErr w:type="gramStart"/>
+      <w:r>
+        <w:rPr>
+          <w:rFonts w:cs="Times New Roman"/>
+          <w:sz w:val="24"/>
+          <w:szCs w:val="24"/>
+        </w:rPr>
+        <w:t>max</w:t>
+      </w:r>
+      <w:proofErr w:type="spellEnd"/>
+      <w:r>
+        <w:rPr>
+          <w:rFonts w:cs="Times New Roman"/>
+          <w:sz w:val="24"/>
+          <w:szCs w:val="24"/>
+        </w:rPr>
+        <w:t>(</w:t>
+      </w:r>
+      <w:proofErr w:type="gramEnd"/>
+      <w:r>
+        <w:rPr>
+          <w:rFonts w:cs="Times New Roman"/>
+          <w:sz w:val="24"/>
+          <w:szCs w:val="24"/>
+        </w:rPr>
+        <w:t xml:space="preserve">0, 40 − </w:t>
+      </w:r>
+      <w:proofErr w:type="spellStart"/>
+      <w:r>
+        <w:rPr>
+          <w:rFonts w:cs="Times New Roman"/>
+          <w:sz w:val="24"/>
+          <w:szCs w:val="24"/>
+        </w:rPr>
+        <w:t>sum</w:t>
+      </w:r>
+      <w:proofErr w:type="spellEnd"/>
+      <w:r>
+        <w:rPr>
+          <w:rFonts w:cs="Times New Roman"/>
+          <w:sz w:val="24"/>
+          <w:szCs w:val="24"/>
+        </w:rPr>
+        <w:t xml:space="preserve">) — содержится в </w:t>
+      </w:r>
+      <w:proofErr w:type="spellStart"/>
+      <w:r>
+        <w:rPr>
+          <w:rFonts w:cs="Times New Roman"/>
+          <w:sz w:val="24"/>
+          <w:szCs w:val="24"/>
+        </w:rPr>
+        <w:t>TimesheetAnalyzer.weeklyOvertime</w:t>
+      </w:r>
+      <w:proofErr w:type="spellEnd"/>
+      <w:r>
+        <w:rPr>
+          <w:rFonts w:cs="Times New Roman"/>
+          <w:sz w:val="24"/>
+          <w:szCs w:val="24"/>
+        </w:rPr>
+        <w:t xml:space="preserve"> и продублирована по смыслу в </w:t>
+      </w:r>
+      <w:proofErr w:type="spellStart"/>
+      <w:r>
+        <w:rPr>
+          <w:rFonts w:cs="Times New Roman"/>
+          <w:sz w:val="24"/>
+          <w:szCs w:val="24"/>
+        </w:rPr>
+        <w:t>addRestHours</w:t>
+      </w:r>
+      <w:proofErr w:type="spellEnd"/>
+      <w:r>
+        <w:rPr>
+          <w:rFonts w:cs="Times New Roman"/>
+          <w:sz w:val="24"/>
+          <w:szCs w:val="24"/>
+        </w:rPr>
+        <w:t xml:space="preserve">. Метод чистый (без состояния, без I/O), переиспользует </w:t>
+      </w:r>
+      <w:proofErr w:type="spellStart"/>
+      <w:r>
+        <w:rPr>
+          <w:rFonts w:cs="Times New Roman"/>
+          <w:sz w:val="24"/>
+          <w:szCs w:val="24"/>
+        </w:rPr>
+        <w:t>total</w:t>
+      </w:r>
+      <w:proofErr w:type="spellEnd"/>
+      <w:r>
+        <w:rPr>
+          <w:rFonts w:cs="Times New Roman"/>
+          <w:sz w:val="24"/>
+          <w:szCs w:val="24"/>
+        </w:rPr>
+        <w:t>, легко тестируется, а порог 40 вынесен в константу WEEKLY_NORMAL_HOURS.</w:t>
+      </w:r>
+    </w:p>
+    <w:p>
+      <w:pPr>
+        <w:spacing w:after="0" w:line="360" w:lineRule="auto"/>
+        <w:rPr>
+          <w:rFonts w:cs="Times New Roman"/>
+          <w:sz w:val="24"/>
+          <w:szCs w:val="24"/>
+        </w:rPr>
+      </w:pPr>
+    </w:p>
+    <w:p>
+      <w:pPr>
+        <w:spacing w:after="0" w:line="360" w:lineRule="auto"/>
+        <w:rPr>
+          <w:rFonts w:cs="Times New Roman"/>
+          <w:sz w:val="24"/>
+          <w:szCs w:val="24"/>
+        </w:rPr>
+      </w:pPr>
+      <w:r>
+        <w:rPr>
+          <w:rFonts w:cs="Times New Roman"/>
+          <w:sz w:val="24"/>
+          <w:szCs w:val="24"/>
+        </w:rPr>
+        <w:t xml:space="preserve">Вопрос 3. Блок n4 (бывший TODO A1) на </w:t>
+      </w:r>
+      <w:proofErr w:type="spellStart"/>
+      <w:r>
+        <w:rPr>
+          <w:rFonts w:cs="Times New Roman"/>
+          <w:sz w:val="24"/>
+          <w:szCs w:val="24"/>
+        </w:rPr>
+        <w:t>Activity</w:t>
+      </w:r>
+      <w:proofErr w:type="spellEnd"/>
+      <w:r>
+        <w:rPr>
+          <w:rFonts w:cs="Times New Roman"/>
+          <w:sz w:val="24"/>
+          <w:szCs w:val="24"/>
+        </w:rPr>
+        <w:t xml:space="preserve">-диаграмме соответствует циклу </w:t>
+      </w:r>
+      <w:proofErr w:type="spellStart"/>
+      <w:r>
+        <w:rPr>
+          <w:rFonts w:cs="Times New Roman"/>
+          <w:sz w:val="24"/>
+          <w:szCs w:val="24"/>
+        </w:rPr>
+        <w:t>for</w:t>
+      </w:r>
+      <w:proofErr w:type="spellEnd"/>
+      <w:r>
+        <w:rPr>
+          <w:rFonts w:cs="Times New Roman"/>
+          <w:sz w:val="24"/>
+          <w:szCs w:val="24"/>
+        </w:rPr>
+        <w:t xml:space="preserve"> в </w:t>
+      </w:r>
+      <w:proofErr w:type="spellStart"/>
+      <w:r>
+        <w:rPr>
+          <w:rFonts w:cs="Times New Roman"/>
+          <w:sz w:val="24"/>
+          <w:szCs w:val="24"/>
+        </w:rPr>
+        <w:t>parseHours</w:t>
+      </w:r>
+      <w:proofErr w:type="spellEnd"/>
+      <w:r>
+        <w:rPr>
+          <w:rFonts w:cs="Times New Roman"/>
+          <w:sz w:val="24"/>
+          <w:szCs w:val="24"/>
+        </w:rPr>
+        <w:t xml:space="preserve">: для каждого элемента проверяется </w:t>
+      </w:r>
+      <w:proofErr w:type="spellStart"/>
+      <w:r>
+        <w:rPr>
+          <w:rFonts w:cs="Times New Roman"/>
+          <w:sz w:val="24"/>
+          <w:szCs w:val="24"/>
+        </w:rPr>
+        <w:t>regex</w:t>
+      </w:r>
+      <w:proofErr w:type="spellEnd"/>
+      <w:r>
+        <w:rPr>
+          <w:rFonts w:cs="Times New Roman"/>
+          <w:sz w:val="24"/>
+          <w:szCs w:val="24"/>
+        </w:rPr>
+        <w:t xml:space="preserve"> </w:t>
+      </w:r>
+      <w:proofErr w:type="gramStart"/>
+      <w:r>
+        <w:rPr>
+          <w:rFonts w:cs="Times New Roman"/>
+          <w:sz w:val="24"/>
+          <w:szCs w:val="24"/>
+        </w:rPr>
+        <w:t>^(</w:t>
+      </w:r>
+      <w:proofErr w:type="gramEnd"/>
+      <w:r>
+        <w:rPr>
+          <w:rFonts w:cs="Times New Roman"/>
+          <w:sz w:val="24"/>
+          <w:szCs w:val="24"/>
+        </w:rPr>
+        <w:t>0</w:t>
+      </w:r>
+      <w:proofErr w:type="gramStart"/>
+      <w:r>
+        <w:rPr>
+          <w:rFonts w:cs="Times New Roman"/>
+          <w:sz w:val="24"/>
+          <w:szCs w:val="24"/>
+        </w:rPr>
+        <w:t>|[</w:t>
+      </w:r>
+      <w:proofErr w:type="gramEnd"/>
+      <w:r>
+        <w:rPr>
+          <w:rFonts w:cs="Times New Roman"/>
+          <w:sz w:val="24"/>
+          <w:szCs w:val="24"/>
+        </w:rPr>
+        <w:t>1-</w:t>
+      </w:r>
+      <w:proofErr w:type="gramStart"/>
+      <w:r>
+        <w:rPr>
+          <w:rFonts w:cs="Times New Roman"/>
+          <w:sz w:val="24"/>
+          <w:szCs w:val="24"/>
+        </w:rPr>
+        <w:t>9][</w:t>
+      </w:r>
+      <w:proofErr w:type="gramEnd"/>
+      <w:r>
+        <w:rPr>
+          <w:rFonts w:cs="Times New Roman"/>
+          <w:sz w:val="24"/>
+          <w:szCs w:val="24"/>
+        </w:rPr>
+        <w:t>0-</w:t>
+      </w:r>
+      <w:proofErr w:type="gramStart"/>
+      <w:r>
+        <w:rPr>
+          <w:rFonts w:cs="Times New Roman"/>
+          <w:sz w:val="24"/>
+          <w:szCs w:val="24"/>
+        </w:rPr>
+        <w:t>9]*</w:t>
+      </w:r>
+      <w:proofErr w:type="gramEnd"/>
+      <w:r>
+        <w:rPr>
+          <w:rFonts w:cs="Times New Roman"/>
+          <w:sz w:val="24"/>
+          <w:szCs w:val="24"/>
+        </w:rPr>
+        <w:t xml:space="preserve">)$ и диапазон [0, 16], затем делается </w:t>
+      </w:r>
+      <w:proofErr w:type="spellStart"/>
+      <w:r>
+        <w:rPr>
+          <w:rFonts w:cs="Times New Roman"/>
+          <w:sz w:val="24"/>
+          <w:szCs w:val="24"/>
+        </w:rPr>
+        <w:t>Integer.parseInt</w:t>
+      </w:r>
+      <w:proofErr w:type="spellEnd"/>
+      <w:r>
+        <w:rPr>
+          <w:rFonts w:cs="Times New Roman"/>
+          <w:sz w:val="24"/>
+          <w:szCs w:val="24"/>
+        </w:rPr>
+        <w:t xml:space="preserve">. Блок n3 — это проверка </w:t>
+      </w:r>
+      <w:proofErr w:type="spellStart"/>
+      <w:proofErr w:type="gramStart"/>
+      <w:r>
+        <w:rPr>
+          <w:rFonts w:cs="Times New Roman"/>
+          <w:sz w:val="24"/>
+          <w:szCs w:val="24"/>
+        </w:rPr>
+        <w:t>parts.length</w:t>
+      </w:r>
+      <w:proofErr w:type="spellEnd"/>
+      <w:r>
+        <w:rPr>
+          <w:rFonts w:cs="Times New Roman"/>
+          <w:sz w:val="24"/>
+          <w:szCs w:val="24"/>
+        </w:rPr>
+        <w:t xml:space="preserve"> !=</w:t>
+      </w:r>
+      <w:proofErr w:type="gramEnd"/>
+      <w:r>
+        <w:rPr>
+          <w:rFonts w:cs="Times New Roman"/>
+          <w:sz w:val="24"/>
+          <w:szCs w:val="24"/>
+        </w:rPr>
+        <w:t xml:space="preserve"> DAYS_IN_WEEK, а n8 — бросок </w:t>
+      </w:r>
+      <w:proofErr w:type="spellStart"/>
+      <w:r>
+        <w:rPr>
+          <w:rFonts w:cs="Times New Roman"/>
+          <w:sz w:val="24"/>
+          <w:szCs w:val="24"/>
+        </w:rPr>
+        <w:t>IllegalArgumentException</w:t>
+      </w:r>
+      <w:proofErr w:type="spellEnd"/>
+      <w:r>
+        <w:rPr>
+          <w:rFonts w:cs="Times New Roman"/>
+          <w:sz w:val="24"/>
+          <w:szCs w:val="24"/>
+        </w:rPr>
+        <w:t>.</w:t>
+      </w:r>
+    </w:p>
+    <w:p>
+      <w:pPr>
+        <w:spacing w:after="0" w:line="360" w:lineRule="auto"/>
+        <w:rPr>
+          <w:rFonts w:cs="Times New Roman"/>
+          <w:sz w:val="24"/>
+          <w:szCs w:val="24"/>
+        </w:rPr>
+      </w:pPr>
+    </w:p>
+    <w:p>
+      <w:pPr>
+        <w:spacing w:after="0" w:line="360" w:lineRule="auto"/>
+        <w:rPr>
+          <w:rFonts w:cs="Times New Roman"/>
+          <w:sz w:val="24"/>
+          <w:szCs w:val="24"/>
+        </w:rPr>
+      </w:pPr>
+      <w:r>
+        <w:rPr>
+          <w:rFonts w:cs="Times New Roman"/>
+          <w:sz w:val="24"/>
+          <w:szCs w:val="24"/>
+        </w:rPr>
+        <w:t xml:space="preserve">Вопрос 4. Изменение порога дневной переработки (например, 8 → 9) затронет один метод </w:t>
+      </w:r>
+      <w:proofErr w:type="spellStart"/>
+      <w:r>
+        <w:rPr>
+          <w:rFonts w:cs="Times New Roman"/>
+          <w:sz w:val="24"/>
+          <w:szCs w:val="24"/>
+        </w:rPr>
+        <w:t>overtimeDays</w:t>
+      </w:r>
+      <w:proofErr w:type="spellEnd"/>
+      <w:r>
+        <w:rPr>
+          <w:rFonts w:cs="Times New Roman"/>
+          <w:sz w:val="24"/>
+          <w:szCs w:val="24"/>
+        </w:rPr>
+        <w:t xml:space="preserve"> и одну константу DAILY_NORMAL_HOURS. Благодаря централизации </w:t>
       </w:r>
       <w:r>
         <w:rPr>
@@ -2047,7 +4404,33 @@
           <w:sz w:val="24"/>
           <w:szCs w:val="24"/>
         </w:rPr>
-        <w:t>[Вставишь после пуша на GitHub: https://github.com/ТВОЙ_НИК/pr5-Nazarenko-MD]</w:t>
+        <w:t xml:space="preserve">[Вставишь после пуша на </w:t>
+      </w:r>
+      <w:proofErr w:type="spellStart"/>
+      <w:r>
+        <w:rPr>
+          <w:rFonts w:cs="Times New Roman"/>
+          <w:sz w:val="24"/>
+          <w:szCs w:val="24"/>
+        </w:rPr>
+        <w:t>GitHub</w:t>
+      </w:r>
+      <w:proofErr w:type="spellEnd"/>
+      <w:r>
+        <w:rPr>
+          <w:rFonts w:cs="Times New Roman"/>
+          <w:sz w:val="24"/>
+          <w:szCs w:val="24"/>
+        </w:rPr>
+        <w:t xml:space="preserve">: </w:t>
+      </w:r>
+      <w:r>
+        <w:rPr>
+          <w:rFonts w:cs="Times New Roman"/>
+          <w:sz w:val="24"/>
+          <w:szCs w:val="24"/>
+        </w:rPr>
+        <w:t>https://github.com/BOENKOMAT-MQ/pr5-Nazarenko-M.D</w:t>
       </w:r>
     </w:p>
     <w:p>

</xml_diff>